<commit_message>
benchmarking data and rereunning at multiple thresholds
</commit_message>
<xml_diff>
--- a/6-02-26.docx
+++ b/6-02-26.docx
@@ -83,81 +83,150 @@
         <w:spacing w:after="0" w:line="240" w:lineRule="auto"/>
         <w:rPr>
           <w:rFonts w:ascii="Helvetica" w:hAnsi="Helvetica" w:cs="Helvetica"/>
-          <w:kern w:val="0"/>
-        </w:rPr>
-      </w:pPr>
-      <w:r>
-        <w:rPr>
-          <w:rFonts w:ascii="Helvetica" w:hAnsi="Helvetica" w:cs="Helvetica"/>
-          <w:kern w:val="0"/>
-        </w:rPr>
-        <w:t xml:space="preserve">80 — flat percentile  — across board </w:t>
-      </w:r>
-      <w:r>
-        <w:rPr>
-          <w:rFonts w:ascii="Helvetica" w:hAnsi="Helvetica" w:cs="Helvetica"/>
-          <w:kern w:val="0"/>
-        </w:rPr>
-        <w:t xml:space="preserve"> -- turn off decrementing, we want a consistent apples-apples comparison  </w:t>
-      </w:r>
-    </w:p>
-    <w:p>
-      <w:pPr>
-        <w:tabs>
-          <w:tab w:val="left" w:pos="720"/>
-          <w:tab w:val="left" w:pos="1440"/>
-          <w:tab w:val="left" w:pos="2160"/>
-          <w:tab w:val="left" w:pos="2880"/>
-          <w:tab w:val="left" w:pos="3600"/>
-          <w:tab w:val="left" w:pos="4320"/>
-          <w:tab w:val="left" w:pos="5040"/>
-          <w:tab w:val="left" w:pos="5760"/>
-          <w:tab w:val="left" w:pos="6480"/>
-          <w:tab w:val="left" w:pos="7200"/>
-          <w:tab w:val="left" w:pos="7920"/>
-          <w:tab w:val="left" w:pos="8640"/>
-        </w:tabs>
-        <w:autoSpaceDE w:val="0"/>
-        <w:autoSpaceDN w:val="0"/>
-        <w:adjustRightInd w:val="0"/>
-        <w:spacing w:after="0" w:line="240" w:lineRule="auto"/>
-        <w:rPr>
-          <w:rFonts w:ascii="Helvetica" w:hAnsi="Helvetica" w:cs="Helvetica"/>
-          <w:kern w:val="0"/>
-        </w:rPr>
-      </w:pPr>
-    </w:p>
-    <w:p>
-      <w:pPr>
-        <w:tabs>
-          <w:tab w:val="left" w:pos="720"/>
-          <w:tab w:val="left" w:pos="1440"/>
-          <w:tab w:val="left" w:pos="2160"/>
-          <w:tab w:val="left" w:pos="2880"/>
-          <w:tab w:val="left" w:pos="3600"/>
-          <w:tab w:val="left" w:pos="4320"/>
-          <w:tab w:val="left" w:pos="5040"/>
-          <w:tab w:val="left" w:pos="5760"/>
-          <w:tab w:val="left" w:pos="6480"/>
-          <w:tab w:val="left" w:pos="7200"/>
-          <w:tab w:val="left" w:pos="7920"/>
-          <w:tab w:val="left" w:pos="8640"/>
-        </w:tabs>
-        <w:autoSpaceDE w:val="0"/>
-        <w:autoSpaceDN w:val="0"/>
-        <w:adjustRightInd w:val="0"/>
-        <w:spacing w:after="0" w:line="240" w:lineRule="auto"/>
-        <w:rPr>
-          <w:rFonts w:ascii="Helvetica" w:hAnsi="Helvetica" w:cs="Helvetica"/>
-          <w:kern w:val="0"/>
-        </w:rPr>
-      </w:pPr>
-      <w:r>
-        <w:rPr>
-          <w:rFonts w:ascii="Helvetica" w:hAnsi="Helvetica" w:cs="Helvetica"/>
-          <w:kern w:val="0"/>
-        </w:rPr>
-        <w:t xml:space="preserve">Add user parameter for minimum diagonal run  — test for floor of 3 bp </w:t>
+          <w:b/>
+          <w:bCs/>
+          <w:color w:val="196B24" w:themeColor="accent3"/>
+          <w:kern w:val="0"/>
+        </w:rPr>
+      </w:pPr>
+      <w:r>
+        <w:rPr>
+          <w:rFonts w:ascii="Helvetica" w:hAnsi="Helvetica" w:cs="Helvetica"/>
+          <w:b/>
+          <w:bCs/>
+          <w:color w:val="196B24" w:themeColor="accent3"/>
+          <w:kern w:val="0"/>
+        </w:rPr>
+        <w:t xml:space="preserve">80 — flat </w:t>
+      </w:r>
+      <w:proofErr w:type="gramStart"/>
+      <w:r>
+        <w:rPr>
+          <w:rFonts w:ascii="Helvetica" w:hAnsi="Helvetica" w:cs="Helvetica"/>
+          <w:b/>
+          <w:bCs/>
+          <w:color w:val="196B24" w:themeColor="accent3"/>
+          <w:kern w:val="0"/>
+        </w:rPr>
+        <w:t>percentile  —</w:t>
+      </w:r>
+      <w:proofErr w:type="gramEnd"/>
+      <w:r>
+        <w:rPr>
+          <w:rFonts w:ascii="Helvetica" w:hAnsi="Helvetica" w:cs="Helvetica"/>
+          <w:b/>
+          <w:bCs/>
+          <w:color w:val="196B24" w:themeColor="accent3"/>
+          <w:kern w:val="0"/>
+        </w:rPr>
+        <w:t xml:space="preserve"> across </w:t>
+      </w:r>
+      <w:proofErr w:type="gramStart"/>
+      <w:r>
+        <w:rPr>
+          <w:rFonts w:ascii="Helvetica" w:hAnsi="Helvetica" w:cs="Helvetica"/>
+          <w:b/>
+          <w:bCs/>
+          <w:color w:val="196B24" w:themeColor="accent3"/>
+          <w:kern w:val="0"/>
+        </w:rPr>
+        <w:t xml:space="preserve">board </w:t>
+      </w:r>
+      <w:r>
+        <w:rPr>
+          <w:rFonts w:ascii="Helvetica" w:hAnsi="Helvetica" w:cs="Helvetica"/>
+          <w:b/>
+          <w:bCs/>
+          <w:color w:val="196B24" w:themeColor="accent3"/>
+          <w:kern w:val="0"/>
+        </w:rPr>
+        <w:t xml:space="preserve"> --</w:t>
+      </w:r>
+      <w:proofErr w:type="gramEnd"/>
+      <w:r>
+        <w:rPr>
+          <w:rFonts w:ascii="Helvetica" w:hAnsi="Helvetica" w:cs="Helvetica"/>
+          <w:b/>
+          <w:bCs/>
+          <w:color w:val="196B24" w:themeColor="accent3"/>
+          <w:kern w:val="0"/>
+        </w:rPr>
+        <w:t xml:space="preserve"> turn off decrementing, we want a consistent apples-apples comparison  </w:t>
+      </w:r>
+    </w:p>
+    <w:p>
+      <w:pPr>
+        <w:tabs>
+          <w:tab w:val="left" w:pos="720"/>
+          <w:tab w:val="left" w:pos="1440"/>
+          <w:tab w:val="left" w:pos="2160"/>
+          <w:tab w:val="left" w:pos="2880"/>
+          <w:tab w:val="left" w:pos="3600"/>
+          <w:tab w:val="left" w:pos="4320"/>
+          <w:tab w:val="left" w:pos="5040"/>
+          <w:tab w:val="left" w:pos="5760"/>
+          <w:tab w:val="left" w:pos="6480"/>
+          <w:tab w:val="left" w:pos="7200"/>
+          <w:tab w:val="left" w:pos="7920"/>
+          <w:tab w:val="left" w:pos="8640"/>
+        </w:tabs>
+        <w:autoSpaceDE w:val="0"/>
+        <w:autoSpaceDN w:val="0"/>
+        <w:adjustRightInd w:val="0"/>
+        <w:spacing w:after="0" w:line="240" w:lineRule="auto"/>
+        <w:rPr>
+          <w:rFonts w:ascii="Helvetica" w:hAnsi="Helvetica" w:cs="Helvetica"/>
+          <w:kern w:val="0"/>
+        </w:rPr>
+      </w:pPr>
+    </w:p>
+    <w:p>
+      <w:pPr>
+        <w:tabs>
+          <w:tab w:val="left" w:pos="720"/>
+          <w:tab w:val="left" w:pos="1440"/>
+          <w:tab w:val="left" w:pos="2160"/>
+          <w:tab w:val="left" w:pos="2880"/>
+          <w:tab w:val="left" w:pos="3600"/>
+          <w:tab w:val="left" w:pos="4320"/>
+          <w:tab w:val="left" w:pos="5040"/>
+          <w:tab w:val="left" w:pos="5760"/>
+          <w:tab w:val="left" w:pos="6480"/>
+          <w:tab w:val="left" w:pos="7200"/>
+          <w:tab w:val="left" w:pos="7920"/>
+          <w:tab w:val="left" w:pos="8640"/>
+        </w:tabs>
+        <w:autoSpaceDE w:val="0"/>
+        <w:autoSpaceDN w:val="0"/>
+        <w:adjustRightInd w:val="0"/>
+        <w:spacing w:after="0" w:line="240" w:lineRule="auto"/>
+        <w:rPr>
+          <w:rFonts w:ascii="Helvetica" w:hAnsi="Helvetica" w:cs="Helvetica"/>
+          <w:kern w:val="0"/>
+        </w:rPr>
+      </w:pPr>
+      <w:r>
+        <w:rPr>
+          <w:rFonts w:ascii="Helvetica" w:hAnsi="Helvetica" w:cs="Helvetica"/>
+          <w:kern w:val="0"/>
+        </w:rPr>
+        <w:t xml:space="preserve">Add user parameter for minimum diagonal </w:t>
+      </w:r>
+      <w:proofErr w:type="gramStart"/>
+      <w:r>
+        <w:rPr>
+          <w:rFonts w:ascii="Helvetica" w:hAnsi="Helvetica" w:cs="Helvetica"/>
+          <w:kern w:val="0"/>
+        </w:rPr>
+        <w:t>run  —</w:t>
+      </w:r>
+      <w:proofErr w:type="gramEnd"/>
+      <w:r>
+        <w:rPr>
+          <w:rFonts w:ascii="Helvetica" w:hAnsi="Helvetica" w:cs="Helvetica"/>
+          <w:kern w:val="0"/>
+        </w:rPr>
+        <w:t xml:space="preserve"> test for floor of 3 bp </w:t>
       </w:r>
     </w:p>
     <w:p>
@@ -275,7 +344,21 @@
           <w:rFonts w:ascii="Helvetica" w:hAnsi="Helvetica" w:cs="Helvetica"/>
           <w:kern w:val="0"/>
         </w:rPr>
-        <w:t xml:space="preserve">Decreasing the threshold increases the probable search space, but does not affect the result </w:t>
+        <w:t xml:space="preserve">Decreasing the threshold increases the probable search space, but does not affect the </w:t>
+      </w:r>
+      <w:r>
+        <w:rPr>
+          <w:rFonts w:ascii="Helvetica" w:hAnsi="Helvetica" w:cs="Helvetica"/>
+          <w:kern w:val="0"/>
+        </w:rPr>
+        <w:t xml:space="preserve">significance of the </w:t>
+      </w:r>
+      <w:r>
+        <w:rPr>
+          <w:rFonts w:ascii="Helvetica" w:hAnsi="Helvetica" w:cs="Helvetica"/>
+          <w:kern w:val="0"/>
+        </w:rPr>
+        <w:t xml:space="preserve">result </w:t>
       </w:r>
     </w:p>
     <w:p>
@@ -994,7 +1077,51 @@
           <w:color w:val="196B24" w:themeColor="accent3"/>
           <w:kern w:val="0"/>
         </w:rPr>
-        <w:t xml:space="preserve">zero p-values = + 1 /(n +  2) in the denominator </w:t>
+        <w:t xml:space="preserve">zero p-values = + 1 </w:t>
+      </w:r>
+      <w:proofErr w:type="gramStart"/>
+      <w:r>
+        <w:rPr>
+          <w:rFonts w:ascii="Helvetica" w:hAnsi="Helvetica" w:cs="Helvetica"/>
+          <w:b/>
+          <w:bCs/>
+          <w:color w:val="196B24" w:themeColor="accent3"/>
+          <w:kern w:val="0"/>
+        </w:rPr>
+        <w:t>/(</w:t>
+      </w:r>
+      <w:proofErr w:type="gramEnd"/>
+      <w:r>
+        <w:rPr>
+          <w:rFonts w:ascii="Helvetica" w:hAnsi="Helvetica" w:cs="Helvetica"/>
+          <w:b/>
+          <w:bCs/>
+          <w:color w:val="196B24" w:themeColor="accent3"/>
+          <w:kern w:val="0"/>
+        </w:rPr>
+        <w:t xml:space="preserve">n </w:t>
+      </w:r>
+      <w:proofErr w:type="gramStart"/>
+      <w:r>
+        <w:rPr>
+          <w:rFonts w:ascii="Helvetica" w:hAnsi="Helvetica" w:cs="Helvetica"/>
+          <w:b/>
+          <w:bCs/>
+          <w:color w:val="196B24" w:themeColor="accent3"/>
+          <w:kern w:val="0"/>
+        </w:rPr>
+        <w:t>+  2</w:t>
+      </w:r>
+      <w:proofErr w:type="gramEnd"/>
+      <w:r>
+        <w:rPr>
+          <w:rFonts w:ascii="Helvetica" w:hAnsi="Helvetica" w:cs="Helvetica"/>
+          <w:b/>
+          <w:bCs/>
+          <w:color w:val="196B24" w:themeColor="accent3"/>
+          <w:kern w:val="0"/>
+        </w:rPr>
+        <w:t xml:space="preserve">) in the denominator </w:t>
       </w:r>
     </w:p>
     <w:p>
@@ -1061,7 +1188,29 @@
           <w:color w:val="196B24" w:themeColor="accent3"/>
           <w:kern w:val="0"/>
         </w:rPr>
-        <w:t>) gives a valid frequentist p-value — it's the probability that a random permutation beats your score, with the observed statistic counted as part of its own reference set. The n+2 correction gives the best point estimate of what the true p-value actually is, given what you observed and a flat prior.</w:t>
+        <w:t xml:space="preserve">) gives a valid frequentist p-value — it's the probability that a random permutation beats your score, with the observed statistic counted as part of its own reference set. The n+2 correction gives the best point estimate of what the true p-value </w:t>
+      </w:r>
+      <w:proofErr w:type="gramStart"/>
+      <w:r>
+        <w:rPr>
+          <w:rFonts w:ascii="Helvetica" w:hAnsi="Helvetica" w:cs="Helvetica"/>
+          <w:b/>
+          <w:bCs/>
+          <w:color w:val="196B24" w:themeColor="accent3"/>
+          <w:kern w:val="0"/>
+        </w:rPr>
+        <w:t>actually is</w:t>
+      </w:r>
+      <w:proofErr w:type="gramEnd"/>
+      <w:r>
+        <w:rPr>
+          <w:rFonts w:ascii="Helvetica" w:hAnsi="Helvetica" w:cs="Helvetica"/>
+          <w:b/>
+          <w:bCs/>
+          <w:color w:val="196B24" w:themeColor="accent3"/>
+          <w:kern w:val="0"/>
+        </w:rPr>
+        <w:t>, given what you observed and a flat prior.</w:t>
       </w:r>
     </w:p>
     <w:p>
@@ -1334,7 +1483,25 @@
           <w:color w:val="196B24" w:themeColor="accent3"/>
           <w:kern w:val="0"/>
         </w:rPr>
-        <w:t>Decrementing the percentile threshold  — the user should do that, leave it alone and let it output just none.</w:t>
+        <w:t xml:space="preserve">Decrementing the percentile </w:t>
+      </w:r>
+      <w:proofErr w:type="gramStart"/>
+      <w:r>
+        <w:rPr>
+          <w:rFonts w:ascii="Helvetica" w:hAnsi="Helvetica" w:cs="Helvetica"/>
+          <w:color w:val="196B24" w:themeColor="accent3"/>
+          <w:kern w:val="0"/>
+        </w:rPr>
+        <w:t>threshold  —</w:t>
+      </w:r>
+      <w:proofErr w:type="gramEnd"/>
+      <w:r>
+        <w:rPr>
+          <w:rFonts w:ascii="Helvetica" w:hAnsi="Helvetica" w:cs="Helvetica"/>
+          <w:color w:val="196B24" w:themeColor="accent3"/>
+          <w:kern w:val="0"/>
+        </w:rPr>
+        <w:t xml:space="preserve"> the user should do that, leave it alone and let it output just none.</w:t>
       </w:r>
       <w:r>
         <w:rPr>
@@ -1474,12 +1641,18 @@
         <w:ind w:hanging="720"/>
         <w:rPr>
           <w:rFonts w:ascii="Helvetica" w:hAnsi="Helvetica" w:cs="Helvetica"/>
-          <w:kern w:val="0"/>
-        </w:rPr>
-      </w:pPr>
-      <w:r>
-        <w:rPr>
-          <w:rFonts w:ascii="Helvetica" w:hAnsi="Helvetica" w:cs="Helvetica"/>
+          <w:b/>
+          <w:bCs/>
+          <w:color w:val="196B24" w:themeColor="accent3"/>
+          <w:kern w:val="0"/>
+        </w:rPr>
+      </w:pPr>
+      <w:r>
+        <w:rPr>
+          <w:rFonts w:ascii="Helvetica" w:hAnsi="Helvetica" w:cs="Helvetica"/>
+          <w:b/>
+          <w:bCs/>
+          <w:color w:val="196B24" w:themeColor="accent3"/>
           <w:kern w:val="0"/>
         </w:rPr>
         <w:t>report</w:t>
@@ -1487,6 +1660,9 @@
       <w:r>
         <w:rPr>
           <w:rFonts w:ascii="Helvetica" w:hAnsi="Helvetica" w:cs="Helvetica"/>
+          <w:b/>
+          <w:bCs/>
+          <w:color w:val="196B24" w:themeColor="accent3"/>
           <w:kern w:val="0"/>
         </w:rPr>
         <w:t xml:space="preserve"> the interstitial space between the two candidates and length </w:t>
@@ -1859,9 +2035,18 @@
           <w:rFonts w:ascii="Helvetica" w:hAnsi="Helvetica" w:cs="Helvetica"/>
           <w:kern w:val="0"/>
         </w:rPr>
-        <w:t>or min(</w:t>
+        <w:t xml:space="preserve">or </w:t>
+      </w:r>
+      <w:proofErr w:type="gramStart"/>
+      <w:r>
+        <w:rPr>
+          <w:rFonts w:ascii="Helvetica" w:hAnsi="Helvetica" w:cs="Helvetica"/>
+          <w:kern w:val="0"/>
+        </w:rPr>
+        <w:t>min(</w:t>
       </w:r>
       <w:proofErr w:type="spellStart"/>
+      <w:proofErr w:type="gramEnd"/>
       <w:r>
         <w:rPr>
           <w:rFonts w:ascii="Helvetica" w:hAnsi="Helvetica" w:cs="Helvetica"/>
@@ -2500,184 +2685,264 @@
           <w:rFonts w:ascii="Helvetica" w:hAnsi="Helvetica" w:cs="Helvetica"/>
           <w:kern w:val="0"/>
         </w:rPr>
-        <w:t xml:space="preserve">* our base assumption of a dimeric (or tetrameric) binding conformation and use that to evaluate the candidate patterns </w:t>
-      </w:r>
-    </w:p>
-    <w:p>
-      <w:pPr>
-        <w:tabs>
-          <w:tab w:val="left" w:pos="720"/>
-          <w:tab w:val="left" w:pos="1440"/>
-          <w:tab w:val="left" w:pos="2160"/>
-          <w:tab w:val="left" w:pos="2880"/>
-          <w:tab w:val="left" w:pos="3600"/>
-          <w:tab w:val="left" w:pos="4320"/>
-          <w:tab w:val="left" w:pos="5040"/>
-          <w:tab w:val="left" w:pos="5760"/>
-          <w:tab w:val="left" w:pos="6480"/>
-          <w:tab w:val="left" w:pos="7200"/>
-          <w:tab w:val="left" w:pos="7920"/>
-          <w:tab w:val="left" w:pos="8640"/>
-        </w:tabs>
-        <w:autoSpaceDE w:val="0"/>
-        <w:autoSpaceDN w:val="0"/>
-        <w:adjustRightInd w:val="0"/>
-        <w:spacing w:after="0" w:line="240" w:lineRule="auto"/>
-        <w:rPr>
-          <w:rFonts w:ascii="Helvetica" w:hAnsi="Helvetica" w:cs="Helvetica"/>
-          <w:kern w:val="0"/>
-        </w:rPr>
-      </w:pPr>
-    </w:p>
-    <w:p>
-      <w:pPr>
-        <w:tabs>
-          <w:tab w:val="left" w:pos="720"/>
-          <w:tab w:val="left" w:pos="1440"/>
-          <w:tab w:val="left" w:pos="2160"/>
-          <w:tab w:val="left" w:pos="2880"/>
-          <w:tab w:val="left" w:pos="3600"/>
-          <w:tab w:val="left" w:pos="4320"/>
-          <w:tab w:val="left" w:pos="5040"/>
-          <w:tab w:val="left" w:pos="5760"/>
-          <w:tab w:val="left" w:pos="6480"/>
-          <w:tab w:val="left" w:pos="7200"/>
-          <w:tab w:val="left" w:pos="7920"/>
-          <w:tab w:val="left" w:pos="8640"/>
-        </w:tabs>
-        <w:autoSpaceDE w:val="0"/>
-        <w:autoSpaceDN w:val="0"/>
-        <w:adjustRightInd w:val="0"/>
-        <w:spacing w:after="0" w:line="240" w:lineRule="auto"/>
-        <w:rPr>
-          <w:rFonts w:ascii="Helvetica" w:hAnsi="Helvetica" w:cs="Helvetica"/>
-          <w:kern w:val="0"/>
-        </w:rPr>
-      </w:pPr>
-      <w:r>
-        <w:rPr>
-          <w:rFonts w:ascii="Helvetica" w:hAnsi="Helvetica" w:cs="Helvetica"/>
-          <w:kern w:val="0"/>
-        </w:rPr>
-        <w:t xml:space="preserve">* we have some downstream outputs from motif discovery, how can we automate the evaluation of whether the motif is an actual binding site or not ? </w:t>
-      </w:r>
-    </w:p>
-    <w:p>
-      <w:pPr>
-        <w:tabs>
-          <w:tab w:val="left" w:pos="720"/>
-          <w:tab w:val="left" w:pos="1440"/>
-          <w:tab w:val="left" w:pos="2160"/>
-          <w:tab w:val="left" w:pos="2880"/>
-          <w:tab w:val="left" w:pos="3600"/>
-          <w:tab w:val="left" w:pos="4320"/>
-          <w:tab w:val="left" w:pos="5040"/>
-          <w:tab w:val="left" w:pos="5760"/>
-          <w:tab w:val="left" w:pos="6480"/>
-          <w:tab w:val="left" w:pos="7200"/>
-          <w:tab w:val="left" w:pos="7920"/>
-          <w:tab w:val="left" w:pos="8640"/>
-        </w:tabs>
-        <w:autoSpaceDE w:val="0"/>
-        <w:autoSpaceDN w:val="0"/>
-        <w:adjustRightInd w:val="0"/>
-        <w:spacing w:after="0" w:line="240" w:lineRule="auto"/>
-        <w:rPr>
-          <w:rFonts w:ascii="Helvetica" w:hAnsi="Helvetica" w:cs="Helvetica"/>
-          <w:kern w:val="0"/>
-        </w:rPr>
-      </w:pPr>
-    </w:p>
-    <w:p>
-      <w:pPr>
-        <w:tabs>
-          <w:tab w:val="left" w:pos="720"/>
-          <w:tab w:val="left" w:pos="1440"/>
-          <w:tab w:val="left" w:pos="2160"/>
-          <w:tab w:val="left" w:pos="2880"/>
-          <w:tab w:val="left" w:pos="3600"/>
-          <w:tab w:val="left" w:pos="4320"/>
-          <w:tab w:val="left" w:pos="5040"/>
-          <w:tab w:val="left" w:pos="5760"/>
-          <w:tab w:val="left" w:pos="6480"/>
-          <w:tab w:val="left" w:pos="7200"/>
-          <w:tab w:val="left" w:pos="7920"/>
-          <w:tab w:val="left" w:pos="8640"/>
-        </w:tabs>
-        <w:autoSpaceDE w:val="0"/>
-        <w:autoSpaceDN w:val="0"/>
-        <w:adjustRightInd w:val="0"/>
-        <w:spacing w:after="0" w:line="240" w:lineRule="auto"/>
-        <w:rPr>
-          <w:rFonts w:ascii="Helvetica" w:hAnsi="Helvetica" w:cs="Helvetica"/>
-          <w:kern w:val="0"/>
-        </w:rPr>
-      </w:pPr>
-    </w:p>
-    <w:p>
-      <w:pPr>
-        <w:tabs>
-          <w:tab w:val="left" w:pos="720"/>
-          <w:tab w:val="left" w:pos="1440"/>
-          <w:tab w:val="left" w:pos="2160"/>
-          <w:tab w:val="left" w:pos="2880"/>
-          <w:tab w:val="left" w:pos="3600"/>
-          <w:tab w:val="left" w:pos="4320"/>
-          <w:tab w:val="left" w:pos="5040"/>
-          <w:tab w:val="left" w:pos="5760"/>
-          <w:tab w:val="left" w:pos="6480"/>
-          <w:tab w:val="left" w:pos="7200"/>
-          <w:tab w:val="left" w:pos="7920"/>
-          <w:tab w:val="left" w:pos="8640"/>
-        </w:tabs>
-        <w:autoSpaceDE w:val="0"/>
-        <w:autoSpaceDN w:val="0"/>
-        <w:adjustRightInd w:val="0"/>
-        <w:spacing w:after="0" w:line="240" w:lineRule="auto"/>
-        <w:rPr>
-          <w:rFonts w:ascii="Helvetica" w:hAnsi="Helvetica" w:cs="Helvetica"/>
-          <w:kern w:val="0"/>
-        </w:rPr>
-      </w:pPr>
-      <w:r>
-        <w:rPr>
-          <w:rFonts w:ascii="Helvetica" w:hAnsi="Helvetica" w:cs="Helvetica"/>
-          <w:kern w:val="0"/>
-        </w:rPr>
-        <w:t xml:space="preserve">* other ways to evaluate a motif candidate — coverage in the genome </w:t>
-      </w:r>
-    </w:p>
-    <w:p>
-      <w:pPr>
-        <w:tabs>
-          <w:tab w:val="left" w:pos="720"/>
-          <w:tab w:val="left" w:pos="1440"/>
-          <w:tab w:val="left" w:pos="2160"/>
-          <w:tab w:val="left" w:pos="2880"/>
-          <w:tab w:val="left" w:pos="3600"/>
-          <w:tab w:val="left" w:pos="4320"/>
-          <w:tab w:val="left" w:pos="5040"/>
-          <w:tab w:val="left" w:pos="5760"/>
-          <w:tab w:val="left" w:pos="6480"/>
-          <w:tab w:val="left" w:pos="7200"/>
-          <w:tab w:val="left" w:pos="7920"/>
-          <w:tab w:val="left" w:pos="8640"/>
-        </w:tabs>
-        <w:autoSpaceDE w:val="0"/>
-        <w:autoSpaceDN w:val="0"/>
-        <w:adjustRightInd w:val="0"/>
-        <w:spacing w:after="0" w:line="240" w:lineRule="auto"/>
-        <w:rPr>
-          <w:rFonts w:ascii="Helvetica" w:hAnsi="Helvetica" w:cs="Helvetica"/>
-          <w:kern w:val="0"/>
-        </w:rPr>
-      </w:pPr>
-      <w:r>
-        <w:rPr>
-          <w:rFonts w:ascii="Helvetica" w:hAnsi="Helvetica" w:cs="Helvetica"/>
-          <w:kern w:val="0"/>
-        </w:rPr>
-        <w:t xml:space="preserve">* the problem is that many things are conserved and statistically significant, but the conservation does not necessarily denote an actual binding site </w:t>
+        <w:t xml:space="preserve">* </w:t>
+      </w:r>
+      <w:proofErr w:type="gramStart"/>
+      <w:r>
+        <w:rPr>
+          <w:rFonts w:ascii="Helvetica" w:hAnsi="Helvetica" w:cs="Helvetica"/>
+          <w:kern w:val="0"/>
+        </w:rPr>
+        <w:t>our</w:t>
+      </w:r>
+      <w:proofErr w:type="gramEnd"/>
+      <w:r>
+        <w:rPr>
+          <w:rFonts w:ascii="Helvetica" w:hAnsi="Helvetica" w:cs="Helvetica"/>
+          <w:kern w:val="0"/>
+        </w:rPr>
+        <w:t xml:space="preserve"> base assumption of a dimeric (or tetrameric) binding conformation and use that to evaluate the candidate patterns </w:t>
+      </w:r>
+    </w:p>
+    <w:p>
+      <w:pPr>
+        <w:tabs>
+          <w:tab w:val="left" w:pos="720"/>
+          <w:tab w:val="left" w:pos="1440"/>
+          <w:tab w:val="left" w:pos="2160"/>
+          <w:tab w:val="left" w:pos="2880"/>
+          <w:tab w:val="left" w:pos="3600"/>
+          <w:tab w:val="left" w:pos="4320"/>
+          <w:tab w:val="left" w:pos="5040"/>
+          <w:tab w:val="left" w:pos="5760"/>
+          <w:tab w:val="left" w:pos="6480"/>
+          <w:tab w:val="left" w:pos="7200"/>
+          <w:tab w:val="left" w:pos="7920"/>
+          <w:tab w:val="left" w:pos="8640"/>
+        </w:tabs>
+        <w:autoSpaceDE w:val="0"/>
+        <w:autoSpaceDN w:val="0"/>
+        <w:adjustRightInd w:val="0"/>
+        <w:spacing w:after="0" w:line="240" w:lineRule="auto"/>
+        <w:rPr>
+          <w:rFonts w:ascii="Helvetica" w:hAnsi="Helvetica" w:cs="Helvetica"/>
+          <w:kern w:val="0"/>
+        </w:rPr>
+      </w:pPr>
+    </w:p>
+    <w:p>
+      <w:pPr>
+        <w:tabs>
+          <w:tab w:val="left" w:pos="720"/>
+          <w:tab w:val="left" w:pos="1440"/>
+          <w:tab w:val="left" w:pos="2160"/>
+          <w:tab w:val="left" w:pos="2880"/>
+          <w:tab w:val="left" w:pos="3600"/>
+          <w:tab w:val="left" w:pos="4320"/>
+          <w:tab w:val="left" w:pos="5040"/>
+          <w:tab w:val="left" w:pos="5760"/>
+          <w:tab w:val="left" w:pos="6480"/>
+          <w:tab w:val="left" w:pos="7200"/>
+          <w:tab w:val="left" w:pos="7920"/>
+          <w:tab w:val="left" w:pos="8640"/>
+        </w:tabs>
+        <w:autoSpaceDE w:val="0"/>
+        <w:autoSpaceDN w:val="0"/>
+        <w:adjustRightInd w:val="0"/>
+        <w:spacing w:after="0" w:line="240" w:lineRule="auto"/>
+        <w:rPr>
+          <w:rFonts w:ascii="Helvetica" w:hAnsi="Helvetica" w:cs="Helvetica"/>
+          <w:kern w:val="0"/>
+        </w:rPr>
+      </w:pPr>
+      <w:r>
+        <w:rPr>
+          <w:rFonts w:ascii="Helvetica" w:hAnsi="Helvetica" w:cs="Helvetica"/>
+          <w:kern w:val="0"/>
+        </w:rPr>
+        <w:t xml:space="preserve">* </w:t>
+      </w:r>
+      <w:proofErr w:type="gramStart"/>
+      <w:r>
+        <w:rPr>
+          <w:rFonts w:ascii="Helvetica" w:hAnsi="Helvetica" w:cs="Helvetica"/>
+          <w:kern w:val="0"/>
+        </w:rPr>
+        <w:t>we</w:t>
+      </w:r>
+      <w:proofErr w:type="gramEnd"/>
+      <w:r>
+        <w:rPr>
+          <w:rFonts w:ascii="Helvetica" w:hAnsi="Helvetica" w:cs="Helvetica"/>
+          <w:kern w:val="0"/>
+        </w:rPr>
+        <w:t xml:space="preserve"> have some downstream outputs from motif discovery, how can we automate the evaluation of whether the motif is an actual binding site or </w:t>
+      </w:r>
+      <w:proofErr w:type="gramStart"/>
+      <w:r>
+        <w:rPr>
+          <w:rFonts w:ascii="Helvetica" w:hAnsi="Helvetica" w:cs="Helvetica"/>
+          <w:kern w:val="0"/>
+        </w:rPr>
+        <w:t>not ?</w:t>
+      </w:r>
+      <w:proofErr w:type="gramEnd"/>
+      <w:r>
+        <w:rPr>
+          <w:rFonts w:ascii="Helvetica" w:hAnsi="Helvetica" w:cs="Helvetica"/>
+          <w:kern w:val="0"/>
+        </w:rPr>
+        <w:t xml:space="preserve"> </w:t>
+      </w:r>
+    </w:p>
+    <w:p>
+      <w:pPr>
+        <w:tabs>
+          <w:tab w:val="left" w:pos="720"/>
+          <w:tab w:val="left" w:pos="1440"/>
+          <w:tab w:val="left" w:pos="2160"/>
+          <w:tab w:val="left" w:pos="2880"/>
+          <w:tab w:val="left" w:pos="3600"/>
+          <w:tab w:val="left" w:pos="4320"/>
+          <w:tab w:val="left" w:pos="5040"/>
+          <w:tab w:val="left" w:pos="5760"/>
+          <w:tab w:val="left" w:pos="6480"/>
+          <w:tab w:val="left" w:pos="7200"/>
+          <w:tab w:val="left" w:pos="7920"/>
+          <w:tab w:val="left" w:pos="8640"/>
+        </w:tabs>
+        <w:autoSpaceDE w:val="0"/>
+        <w:autoSpaceDN w:val="0"/>
+        <w:adjustRightInd w:val="0"/>
+        <w:spacing w:after="0" w:line="240" w:lineRule="auto"/>
+        <w:rPr>
+          <w:rFonts w:ascii="Helvetica" w:hAnsi="Helvetica" w:cs="Helvetica"/>
+          <w:kern w:val="0"/>
+        </w:rPr>
+      </w:pPr>
+    </w:p>
+    <w:p>
+      <w:pPr>
+        <w:tabs>
+          <w:tab w:val="left" w:pos="720"/>
+          <w:tab w:val="left" w:pos="1440"/>
+          <w:tab w:val="left" w:pos="2160"/>
+          <w:tab w:val="left" w:pos="2880"/>
+          <w:tab w:val="left" w:pos="3600"/>
+          <w:tab w:val="left" w:pos="4320"/>
+          <w:tab w:val="left" w:pos="5040"/>
+          <w:tab w:val="left" w:pos="5760"/>
+          <w:tab w:val="left" w:pos="6480"/>
+          <w:tab w:val="left" w:pos="7200"/>
+          <w:tab w:val="left" w:pos="7920"/>
+          <w:tab w:val="left" w:pos="8640"/>
+        </w:tabs>
+        <w:autoSpaceDE w:val="0"/>
+        <w:autoSpaceDN w:val="0"/>
+        <w:adjustRightInd w:val="0"/>
+        <w:spacing w:after="0" w:line="240" w:lineRule="auto"/>
+        <w:rPr>
+          <w:rFonts w:ascii="Helvetica" w:hAnsi="Helvetica" w:cs="Helvetica"/>
+          <w:kern w:val="0"/>
+        </w:rPr>
+      </w:pPr>
+    </w:p>
+    <w:p>
+      <w:pPr>
+        <w:tabs>
+          <w:tab w:val="left" w:pos="720"/>
+          <w:tab w:val="left" w:pos="1440"/>
+          <w:tab w:val="left" w:pos="2160"/>
+          <w:tab w:val="left" w:pos="2880"/>
+          <w:tab w:val="left" w:pos="3600"/>
+          <w:tab w:val="left" w:pos="4320"/>
+          <w:tab w:val="left" w:pos="5040"/>
+          <w:tab w:val="left" w:pos="5760"/>
+          <w:tab w:val="left" w:pos="6480"/>
+          <w:tab w:val="left" w:pos="7200"/>
+          <w:tab w:val="left" w:pos="7920"/>
+          <w:tab w:val="left" w:pos="8640"/>
+        </w:tabs>
+        <w:autoSpaceDE w:val="0"/>
+        <w:autoSpaceDN w:val="0"/>
+        <w:adjustRightInd w:val="0"/>
+        <w:spacing w:after="0" w:line="240" w:lineRule="auto"/>
+        <w:rPr>
+          <w:rFonts w:ascii="Helvetica" w:hAnsi="Helvetica" w:cs="Helvetica"/>
+          <w:kern w:val="0"/>
+        </w:rPr>
+      </w:pPr>
+      <w:r>
+        <w:rPr>
+          <w:rFonts w:ascii="Helvetica" w:hAnsi="Helvetica" w:cs="Helvetica"/>
+          <w:kern w:val="0"/>
+        </w:rPr>
+        <w:t xml:space="preserve">* </w:t>
+      </w:r>
+      <w:proofErr w:type="gramStart"/>
+      <w:r>
+        <w:rPr>
+          <w:rFonts w:ascii="Helvetica" w:hAnsi="Helvetica" w:cs="Helvetica"/>
+          <w:kern w:val="0"/>
+        </w:rPr>
+        <w:t>other</w:t>
+      </w:r>
+      <w:proofErr w:type="gramEnd"/>
+      <w:r>
+        <w:rPr>
+          <w:rFonts w:ascii="Helvetica" w:hAnsi="Helvetica" w:cs="Helvetica"/>
+          <w:kern w:val="0"/>
+        </w:rPr>
+        <w:t xml:space="preserve"> ways to evaluate a motif candidate — coverage in the genome </w:t>
+      </w:r>
+    </w:p>
+    <w:p>
+      <w:pPr>
+        <w:tabs>
+          <w:tab w:val="left" w:pos="720"/>
+          <w:tab w:val="left" w:pos="1440"/>
+          <w:tab w:val="left" w:pos="2160"/>
+          <w:tab w:val="left" w:pos="2880"/>
+          <w:tab w:val="left" w:pos="3600"/>
+          <w:tab w:val="left" w:pos="4320"/>
+          <w:tab w:val="left" w:pos="5040"/>
+          <w:tab w:val="left" w:pos="5760"/>
+          <w:tab w:val="left" w:pos="6480"/>
+          <w:tab w:val="left" w:pos="7200"/>
+          <w:tab w:val="left" w:pos="7920"/>
+          <w:tab w:val="left" w:pos="8640"/>
+        </w:tabs>
+        <w:autoSpaceDE w:val="0"/>
+        <w:autoSpaceDN w:val="0"/>
+        <w:adjustRightInd w:val="0"/>
+        <w:spacing w:after="0" w:line="240" w:lineRule="auto"/>
+        <w:rPr>
+          <w:rFonts w:ascii="Helvetica" w:hAnsi="Helvetica" w:cs="Helvetica"/>
+          <w:kern w:val="0"/>
+        </w:rPr>
+      </w:pPr>
+      <w:r>
+        <w:rPr>
+          <w:rFonts w:ascii="Helvetica" w:hAnsi="Helvetica" w:cs="Helvetica"/>
+          <w:kern w:val="0"/>
+        </w:rPr>
+        <w:t xml:space="preserve">* </w:t>
+      </w:r>
+      <w:proofErr w:type="gramStart"/>
+      <w:r>
+        <w:rPr>
+          <w:rFonts w:ascii="Helvetica" w:hAnsi="Helvetica" w:cs="Helvetica"/>
+          <w:kern w:val="0"/>
+        </w:rPr>
+        <w:t>the</w:t>
+      </w:r>
+      <w:proofErr w:type="gramEnd"/>
+      <w:r>
+        <w:rPr>
+          <w:rFonts w:ascii="Helvetica" w:hAnsi="Helvetica" w:cs="Helvetica"/>
+          <w:kern w:val="0"/>
+        </w:rPr>
+        <w:t xml:space="preserve"> problem is that many things are conserved and statistically significant, but the conservation does not necessarily denote an actual binding site </w:t>
       </w:r>
     </w:p>
     <w:p>
@@ -2748,7 +3013,23 @@
           <w:rFonts w:ascii="Helvetica" w:hAnsi="Helvetica" w:cs="Helvetica"/>
           <w:kern w:val="0"/>
         </w:rPr>
-        <w:t xml:space="preserve">for our case of the bacterial transcription factors we use the base heuristic that the IR/DR  </w:t>
+        <w:t xml:space="preserve">for our case of the bacterial transcription </w:t>
+      </w:r>
+      <w:proofErr w:type="gramStart"/>
+      <w:r>
+        <w:rPr>
+          <w:rFonts w:ascii="Helvetica" w:hAnsi="Helvetica" w:cs="Helvetica"/>
+          <w:kern w:val="0"/>
+        </w:rPr>
+        <w:t>factors</w:t>
+      </w:r>
+      <w:proofErr w:type="gramEnd"/>
+      <w:r>
+        <w:rPr>
+          <w:rFonts w:ascii="Helvetica" w:hAnsi="Helvetica" w:cs="Helvetica"/>
+          <w:kern w:val="0"/>
+        </w:rPr>
+        <w:t xml:space="preserve"> we use the base heuristic that the IR/DR  </w:t>
       </w:r>
     </w:p>
     <w:p>

</xml_diff>

<commit_message>
new results and analysis / aggregation charts
</commit_message>
<xml_diff>
--- a/6-02-26.docx
+++ b/6-02-26.docx
@@ -27,6 +27,1359 @@
           <w:kern w:val="0"/>
         </w:rPr>
       </w:pPr>
+    </w:p>
+    <w:p>
+      <w:pPr>
+        <w:tabs>
+          <w:tab w:val="left" w:pos="720"/>
+          <w:tab w:val="left" w:pos="1440"/>
+          <w:tab w:val="left" w:pos="2160"/>
+          <w:tab w:val="left" w:pos="2880"/>
+          <w:tab w:val="left" w:pos="3600"/>
+          <w:tab w:val="left" w:pos="4320"/>
+          <w:tab w:val="left" w:pos="5040"/>
+          <w:tab w:val="left" w:pos="5760"/>
+          <w:tab w:val="left" w:pos="6480"/>
+          <w:tab w:val="left" w:pos="7200"/>
+          <w:tab w:val="left" w:pos="7920"/>
+          <w:tab w:val="left" w:pos="8640"/>
+        </w:tabs>
+        <w:autoSpaceDE w:val="0"/>
+        <w:autoSpaceDN w:val="0"/>
+        <w:adjustRightInd w:val="0"/>
+        <w:spacing w:after="0" w:line="240" w:lineRule="auto"/>
+        <w:rPr>
+          <w:rFonts w:ascii="Helvetica" w:hAnsi="Helvetica" w:cs="Helvetica"/>
+          <w:kern w:val="0"/>
+        </w:rPr>
+      </w:pPr>
+    </w:p>
+    <w:p>
+      <w:pPr>
+        <w:tabs>
+          <w:tab w:val="left" w:pos="720"/>
+          <w:tab w:val="left" w:pos="1440"/>
+          <w:tab w:val="left" w:pos="2160"/>
+          <w:tab w:val="left" w:pos="2880"/>
+          <w:tab w:val="left" w:pos="3600"/>
+          <w:tab w:val="left" w:pos="4320"/>
+          <w:tab w:val="left" w:pos="5040"/>
+          <w:tab w:val="left" w:pos="5760"/>
+          <w:tab w:val="left" w:pos="6480"/>
+          <w:tab w:val="left" w:pos="7200"/>
+          <w:tab w:val="left" w:pos="7920"/>
+          <w:tab w:val="left" w:pos="8640"/>
+        </w:tabs>
+        <w:autoSpaceDE w:val="0"/>
+        <w:autoSpaceDN w:val="0"/>
+        <w:adjustRightInd w:val="0"/>
+        <w:spacing w:after="0" w:line="240" w:lineRule="auto"/>
+        <w:rPr>
+          <w:rFonts w:ascii="Helvetica" w:hAnsi="Helvetica" w:cs="Helvetica"/>
+          <w:kern w:val="0"/>
+        </w:rPr>
+      </w:pPr>
+      <w:r>
+        <w:rPr>
+          <w:rFonts w:ascii="Helvetica" w:hAnsi="Helvetica" w:cs="Helvetica"/>
+          <w:kern w:val="0"/>
+        </w:rPr>
+        <w:t>6-09-26</w:t>
+      </w:r>
+    </w:p>
+    <w:p>
+      <w:pPr>
+        <w:tabs>
+          <w:tab w:val="left" w:pos="720"/>
+          <w:tab w:val="left" w:pos="1440"/>
+          <w:tab w:val="left" w:pos="2160"/>
+          <w:tab w:val="left" w:pos="2880"/>
+          <w:tab w:val="left" w:pos="3600"/>
+          <w:tab w:val="left" w:pos="4320"/>
+          <w:tab w:val="left" w:pos="5040"/>
+          <w:tab w:val="left" w:pos="5760"/>
+          <w:tab w:val="left" w:pos="6480"/>
+          <w:tab w:val="left" w:pos="7200"/>
+          <w:tab w:val="left" w:pos="7920"/>
+          <w:tab w:val="left" w:pos="8640"/>
+        </w:tabs>
+        <w:autoSpaceDE w:val="0"/>
+        <w:autoSpaceDN w:val="0"/>
+        <w:adjustRightInd w:val="0"/>
+        <w:spacing w:after="0" w:line="240" w:lineRule="auto"/>
+        <w:rPr>
+          <w:rFonts w:ascii="Helvetica" w:hAnsi="Helvetica" w:cs="Helvetica"/>
+          <w:kern w:val="0"/>
+        </w:rPr>
+      </w:pPr>
+    </w:p>
+    <w:p>
+      <w:pPr>
+        <w:pStyle w:val="ListParagraph"/>
+        <w:numPr>
+          <w:ilvl w:val="0"/>
+          <w:numId w:val="8"/>
+        </w:numPr>
+        <w:tabs>
+          <w:tab w:val="left" w:pos="720"/>
+          <w:tab w:val="left" w:pos="1440"/>
+          <w:tab w:val="left" w:pos="2160"/>
+          <w:tab w:val="left" w:pos="2880"/>
+          <w:tab w:val="left" w:pos="3600"/>
+          <w:tab w:val="left" w:pos="4320"/>
+          <w:tab w:val="left" w:pos="5040"/>
+          <w:tab w:val="left" w:pos="5760"/>
+          <w:tab w:val="left" w:pos="6480"/>
+          <w:tab w:val="left" w:pos="7200"/>
+          <w:tab w:val="left" w:pos="7920"/>
+          <w:tab w:val="left" w:pos="8640"/>
+        </w:tabs>
+        <w:autoSpaceDE w:val="0"/>
+        <w:autoSpaceDN w:val="0"/>
+        <w:adjustRightInd w:val="0"/>
+        <w:spacing w:after="0" w:line="240" w:lineRule="auto"/>
+        <w:rPr>
+          <w:rFonts w:ascii="Helvetica" w:hAnsi="Helvetica" w:cs="Helvetica"/>
+          <w:kern w:val="0"/>
+        </w:rPr>
+      </w:pPr>
+      <w:r>
+        <w:rPr>
+          <w:rFonts w:ascii="Helvetica" w:hAnsi="Helvetica" w:cs="Helvetica"/>
+          <w:kern w:val="0"/>
+        </w:rPr>
+        <w:t>For each observation</w:t>
+      </w:r>
+      <w:r>
+        <w:rPr>
+          <w:rFonts w:ascii="Helvetica" w:hAnsi="Helvetica" w:cs="Helvetica"/>
+          <w:kern w:val="0"/>
+        </w:rPr>
+        <w:t xml:space="preserve">, across the thresholds plot the p-values </w:t>
+      </w:r>
+    </w:p>
+    <w:p>
+      <w:pPr>
+        <w:pStyle w:val="ListParagraph"/>
+        <w:numPr>
+          <w:ilvl w:val="0"/>
+          <w:numId w:val="8"/>
+        </w:numPr>
+        <w:tabs>
+          <w:tab w:val="left" w:pos="720"/>
+          <w:tab w:val="left" w:pos="1440"/>
+          <w:tab w:val="left" w:pos="2160"/>
+          <w:tab w:val="left" w:pos="2880"/>
+          <w:tab w:val="left" w:pos="3600"/>
+          <w:tab w:val="left" w:pos="4320"/>
+          <w:tab w:val="left" w:pos="5040"/>
+          <w:tab w:val="left" w:pos="5760"/>
+          <w:tab w:val="left" w:pos="6480"/>
+          <w:tab w:val="left" w:pos="7200"/>
+          <w:tab w:val="left" w:pos="7920"/>
+          <w:tab w:val="left" w:pos="8640"/>
+        </w:tabs>
+        <w:autoSpaceDE w:val="0"/>
+        <w:autoSpaceDN w:val="0"/>
+        <w:adjustRightInd w:val="0"/>
+        <w:spacing w:after="0" w:line="240" w:lineRule="auto"/>
+        <w:rPr>
+          <w:rFonts w:ascii="Helvetica" w:hAnsi="Helvetica" w:cs="Helvetica"/>
+          <w:kern w:val="0"/>
+        </w:rPr>
+      </w:pPr>
+      <w:r>
+        <w:rPr>
+          <w:rFonts w:ascii="Helvetica" w:hAnsi="Helvetica" w:cs="Helvetica"/>
+          <w:kern w:val="0"/>
+        </w:rPr>
+        <w:t xml:space="preserve">If the curves are monotonic, then we don’t have an optimal stopping point </w:t>
+      </w:r>
+    </w:p>
+    <w:p>
+      <w:pPr>
+        <w:pStyle w:val="ListParagraph"/>
+        <w:numPr>
+          <w:ilvl w:val="1"/>
+          <w:numId w:val="8"/>
+        </w:numPr>
+        <w:tabs>
+          <w:tab w:val="left" w:pos="720"/>
+          <w:tab w:val="left" w:pos="1440"/>
+          <w:tab w:val="left" w:pos="2160"/>
+          <w:tab w:val="left" w:pos="2880"/>
+          <w:tab w:val="left" w:pos="3600"/>
+          <w:tab w:val="left" w:pos="4320"/>
+          <w:tab w:val="left" w:pos="5040"/>
+          <w:tab w:val="left" w:pos="5760"/>
+          <w:tab w:val="left" w:pos="6480"/>
+          <w:tab w:val="left" w:pos="7200"/>
+          <w:tab w:val="left" w:pos="7920"/>
+          <w:tab w:val="left" w:pos="8640"/>
+        </w:tabs>
+        <w:autoSpaceDE w:val="0"/>
+        <w:autoSpaceDN w:val="0"/>
+        <w:adjustRightInd w:val="0"/>
+        <w:spacing w:after="0" w:line="240" w:lineRule="auto"/>
+        <w:rPr>
+          <w:rFonts w:ascii="Helvetica" w:hAnsi="Helvetica" w:cs="Helvetica"/>
+          <w:kern w:val="0"/>
+        </w:rPr>
+      </w:pPr>
+      <w:r>
+        <w:rPr>
+          <w:rFonts w:ascii="Helvetica" w:hAnsi="Helvetica" w:cs="Helvetica"/>
+          <w:kern w:val="0"/>
+        </w:rPr>
+        <w:t xml:space="preserve">Then move to having user-specified length </w:t>
+      </w:r>
+    </w:p>
+    <w:p>
+      <w:pPr>
+        <w:tabs>
+          <w:tab w:val="left" w:pos="720"/>
+          <w:tab w:val="left" w:pos="1440"/>
+          <w:tab w:val="left" w:pos="2160"/>
+          <w:tab w:val="left" w:pos="2880"/>
+          <w:tab w:val="left" w:pos="3600"/>
+          <w:tab w:val="left" w:pos="4320"/>
+          <w:tab w:val="left" w:pos="5040"/>
+          <w:tab w:val="left" w:pos="5760"/>
+          <w:tab w:val="left" w:pos="6480"/>
+          <w:tab w:val="left" w:pos="7200"/>
+          <w:tab w:val="left" w:pos="7920"/>
+          <w:tab w:val="left" w:pos="8640"/>
+        </w:tabs>
+        <w:autoSpaceDE w:val="0"/>
+        <w:autoSpaceDN w:val="0"/>
+        <w:adjustRightInd w:val="0"/>
+        <w:spacing w:after="0" w:line="240" w:lineRule="auto"/>
+        <w:rPr>
+          <w:rFonts w:ascii="Helvetica" w:hAnsi="Helvetica" w:cs="Helvetica"/>
+          <w:kern w:val="0"/>
+        </w:rPr>
+      </w:pPr>
+    </w:p>
+    <w:p>
+      <w:pPr>
+        <w:tabs>
+          <w:tab w:val="left" w:pos="720"/>
+          <w:tab w:val="left" w:pos="1440"/>
+          <w:tab w:val="left" w:pos="2160"/>
+          <w:tab w:val="left" w:pos="2880"/>
+          <w:tab w:val="left" w:pos="3600"/>
+          <w:tab w:val="left" w:pos="4320"/>
+          <w:tab w:val="left" w:pos="5040"/>
+          <w:tab w:val="left" w:pos="5760"/>
+          <w:tab w:val="left" w:pos="6480"/>
+          <w:tab w:val="left" w:pos="7200"/>
+          <w:tab w:val="left" w:pos="7920"/>
+          <w:tab w:val="left" w:pos="8640"/>
+        </w:tabs>
+        <w:autoSpaceDE w:val="0"/>
+        <w:autoSpaceDN w:val="0"/>
+        <w:adjustRightInd w:val="0"/>
+        <w:spacing w:after="0" w:line="240" w:lineRule="auto"/>
+        <w:rPr>
+          <w:rFonts w:ascii="Helvetica" w:hAnsi="Helvetica" w:cs="Helvetica"/>
+          <w:kern w:val="0"/>
+        </w:rPr>
+      </w:pPr>
+    </w:p>
+    <w:p>
+      <w:pPr>
+        <w:tabs>
+          <w:tab w:val="left" w:pos="720"/>
+          <w:tab w:val="left" w:pos="1440"/>
+          <w:tab w:val="left" w:pos="2160"/>
+          <w:tab w:val="left" w:pos="2880"/>
+          <w:tab w:val="left" w:pos="3600"/>
+          <w:tab w:val="left" w:pos="4320"/>
+          <w:tab w:val="left" w:pos="5040"/>
+          <w:tab w:val="left" w:pos="5760"/>
+          <w:tab w:val="left" w:pos="6480"/>
+          <w:tab w:val="left" w:pos="7200"/>
+          <w:tab w:val="left" w:pos="7920"/>
+          <w:tab w:val="left" w:pos="8640"/>
+        </w:tabs>
+        <w:autoSpaceDE w:val="0"/>
+        <w:autoSpaceDN w:val="0"/>
+        <w:adjustRightInd w:val="0"/>
+        <w:spacing w:after="0" w:line="240" w:lineRule="auto"/>
+        <w:rPr>
+          <w:rFonts w:ascii="Helvetica" w:hAnsi="Helvetica" w:cs="Helvetica"/>
+          <w:kern w:val="0"/>
+        </w:rPr>
+      </w:pPr>
+    </w:p>
+    <w:p>
+      <w:pPr>
+        <w:tabs>
+          <w:tab w:val="left" w:pos="720"/>
+          <w:tab w:val="left" w:pos="1440"/>
+          <w:tab w:val="left" w:pos="2160"/>
+          <w:tab w:val="left" w:pos="2880"/>
+          <w:tab w:val="left" w:pos="3600"/>
+          <w:tab w:val="left" w:pos="4320"/>
+          <w:tab w:val="left" w:pos="5040"/>
+          <w:tab w:val="left" w:pos="5760"/>
+          <w:tab w:val="left" w:pos="6480"/>
+          <w:tab w:val="left" w:pos="7200"/>
+          <w:tab w:val="left" w:pos="7920"/>
+          <w:tab w:val="left" w:pos="8640"/>
+        </w:tabs>
+        <w:autoSpaceDE w:val="0"/>
+        <w:autoSpaceDN w:val="0"/>
+        <w:adjustRightInd w:val="0"/>
+        <w:spacing w:after="0" w:line="240" w:lineRule="auto"/>
+        <w:rPr>
+          <w:rFonts w:ascii="Helvetica" w:hAnsi="Helvetica" w:cs="Helvetica"/>
+          <w:kern w:val="0"/>
+        </w:rPr>
+      </w:pPr>
+    </w:p>
+    <w:p>
+      <w:pPr>
+        <w:tabs>
+          <w:tab w:val="left" w:pos="720"/>
+          <w:tab w:val="left" w:pos="1440"/>
+          <w:tab w:val="left" w:pos="2160"/>
+          <w:tab w:val="left" w:pos="2880"/>
+          <w:tab w:val="left" w:pos="3600"/>
+          <w:tab w:val="left" w:pos="4320"/>
+          <w:tab w:val="left" w:pos="5040"/>
+          <w:tab w:val="left" w:pos="5760"/>
+          <w:tab w:val="left" w:pos="6480"/>
+          <w:tab w:val="left" w:pos="7200"/>
+          <w:tab w:val="left" w:pos="7920"/>
+          <w:tab w:val="left" w:pos="8640"/>
+        </w:tabs>
+        <w:autoSpaceDE w:val="0"/>
+        <w:autoSpaceDN w:val="0"/>
+        <w:adjustRightInd w:val="0"/>
+        <w:spacing w:after="0" w:line="240" w:lineRule="auto"/>
+        <w:rPr>
+          <w:rFonts w:ascii="Helvetica" w:hAnsi="Helvetica" w:cs="Helvetica"/>
+          <w:kern w:val="0"/>
+        </w:rPr>
+      </w:pPr>
+    </w:p>
+    <w:p>
+      <w:pPr>
+        <w:tabs>
+          <w:tab w:val="left" w:pos="720"/>
+          <w:tab w:val="left" w:pos="1440"/>
+          <w:tab w:val="left" w:pos="2160"/>
+          <w:tab w:val="left" w:pos="2880"/>
+          <w:tab w:val="left" w:pos="3600"/>
+          <w:tab w:val="left" w:pos="4320"/>
+          <w:tab w:val="left" w:pos="5040"/>
+          <w:tab w:val="left" w:pos="5760"/>
+          <w:tab w:val="left" w:pos="6480"/>
+          <w:tab w:val="left" w:pos="7200"/>
+          <w:tab w:val="left" w:pos="7920"/>
+          <w:tab w:val="left" w:pos="8640"/>
+        </w:tabs>
+        <w:autoSpaceDE w:val="0"/>
+        <w:autoSpaceDN w:val="0"/>
+        <w:adjustRightInd w:val="0"/>
+        <w:spacing w:after="0" w:line="240" w:lineRule="auto"/>
+        <w:rPr>
+          <w:rFonts w:ascii="Helvetica" w:hAnsi="Helvetica" w:cs="Helvetica"/>
+          <w:kern w:val="0"/>
+        </w:rPr>
+      </w:pPr>
+      <w:r>
+        <w:rPr>
+          <w:rFonts w:ascii="Helvetica" w:hAnsi="Helvetica" w:cs="Helvetica"/>
+          <w:kern w:val="0"/>
+        </w:rPr>
+        <w:t>06-07-26</w:t>
+      </w:r>
+    </w:p>
+    <w:p>
+      <w:pPr>
+        <w:tabs>
+          <w:tab w:val="left" w:pos="720"/>
+          <w:tab w:val="left" w:pos="1440"/>
+          <w:tab w:val="left" w:pos="2160"/>
+          <w:tab w:val="left" w:pos="2880"/>
+          <w:tab w:val="left" w:pos="3600"/>
+          <w:tab w:val="left" w:pos="4320"/>
+          <w:tab w:val="left" w:pos="5040"/>
+          <w:tab w:val="left" w:pos="5760"/>
+          <w:tab w:val="left" w:pos="6480"/>
+          <w:tab w:val="left" w:pos="7200"/>
+          <w:tab w:val="left" w:pos="7920"/>
+          <w:tab w:val="left" w:pos="8640"/>
+        </w:tabs>
+        <w:autoSpaceDE w:val="0"/>
+        <w:autoSpaceDN w:val="0"/>
+        <w:adjustRightInd w:val="0"/>
+        <w:spacing w:after="0" w:line="240" w:lineRule="auto"/>
+        <w:rPr>
+          <w:rFonts w:ascii="Helvetica" w:hAnsi="Helvetica" w:cs="Helvetica"/>
+          <w:kern w:val="0"/>
+        </w:rPr>
+      </w:pPr>
+    </w:p>
+    <w:p>
+      <w:pPr>
+        <w:tabs>
+          <w:tab w:val="left" w:pos="720"/>
+          <w:tab w:val="left" w:pos="1440"/>
+          <w:tab w:val="left" w:pos="2160"/>
+          <w:tab w:val="left" w:pos="2880"/>
+          <w:tab w:val="left" w:pos="3600"/>
+          <w:tab w:val="left" w:pos="4320"/>
+          <w:tab w:val="left" w:pos="5040"/>
+          <w:tab w:val="left" w:pos="5760"/>
+          <w:tab w:val="left" w:pos="6480"/>
+          <w:tab w:val="left" w:pos="7200"/>
+          <w:tab w:val="left" w:pos="7920"/>
+          <w:tab w:val="left" w:pos="8640"/>
+        </w:tabs>
+        <w:autoSpaceDE w:val="0"/>
+        <w:autoSpaceDN w:val="0"/>
+        <w:adjustRightInd w:val="0"/>
+        <w:spacing w:after="0" w:line="240" w:lineRule="auto"/>
+        <w:rPr>
+          <w:rFonts w:ascii="Helvetica" w:hAnsi="Helvetica" w:cs="Helvetica"/>
+          <w:kern w:val="0"/>
+        </w:rPr>
+      </w:pPr>
+      <w:r>
+        <w:rPr>
+          <w:rFonts w:ascii="Helvetica" w:hAnsi="Helvetica" w:cs="Helvetica"/>
+          <w:kern w:val="0"/>
+        </w:rPr>
+        <w:t>in the same directories for each percentage threshold, there are also files called XX_best_conclusion_data.xlsx. In these spreadsheets there is a column called Alignment</w:t>
+      </w:r>
+      <w:r>
+        <w:rPr>
+          <w:rFonts w:ascii="Helvetica" w:hAnsi="Helvetica" w:cs="Helvetica"/>
+          <w:kern w:val="0"/>
+        </w:rPr>
+        <w:t xml:space="preserve"> that has the values “strong agree”, “strong disagree”, “weak agree”, and “weak disagree”.</w:t>
+      </w:r>
+      <w:r>
+        <w:rPr>
+          <w:rFonts w:ascii="Helvetica" w:hAnsi="Helvetica" w:cs="Helvetica"/>
+          <w:kern w:val="0"/>
+        </w:rPr>
+        <w:t xml:space="preserve"> </w:t>
+      </w:r>
+      <w:r>
+        <w:rPr>
+          <w:rFonts w:ascii="Helvetica" w:hAnsi="Helvetica" w:cs="Helvetica"/>
+          <w:kern w:val="0"/>
+        </w:rPr>
+        <w:t xml:space="preserve">For each available value of XX, I would like to generate a </w:t>
+      </w:r>
+      <w:proofErr w:type="spellStart"/>
+      <w:r>
+        <w:rPr>
+          <w:rFonts w:ascii="Helvetica" w:hAnsi="Helvetica" w:cs="Helvetica"/>
+          <w:kern w:val="0"/>
+        </w:rPr>
+        <w:t>dataframe</w:t>
+      </w:r>
+      <w:proofErr w:type="spellEnd"/>
+      <w:r>
+        <w:rPr>
+          <w:rFonts w:ascii="Helvetica" w:hAnsi="Helvetica" w:cs="Helvetica"/>
+          <w:kern w:val="0"/>
+        </w:rPr>
+        <w:t xml:space="preserve"> and chart where the X-axis is the value of XX (0 – 90), and the Y-axis is the proportion of incidence of the values of Alignment in the XX dataset. There should be four color-coded lines that correspond to the values of Alignment. </w:t>
+      </w:r>
+      <w:r>
+        <w:rPr>
+          <w:rFonts w:ascii="Helvetica" w:hAnsi="Helvetica" w:cs="Helvetica"/>
+          <w:kern w:val="0"/>
+        </w:rPr>
+        <w:t xml:space="preserve">The purpose of this is to show how the rate of alignment differs across different thresholds (values of XX). </w:t>
+      </w:r>
+    </w:p>
+    <w:p>
+      <w:pPr>
+        <w:tabs>
+          <w:tab w:val="left" w:pos="720"/>
+          <w:tab w:val="left" w:pos="1440"/>
+          <w:tab w:val="left" w:pos="2160"/>
+          <w:tab w:val="left" w:pos="2880"/>
+          <w:tab w:val="left" w:pos="3600"/>
+          <w:tab w:val="left" w:pos="4320"/>
+          <w:tab w:val="left" w:pos="5040"/>
+          <w:tab w:val="left" w:pos="5760"/>
+          <w:tab w:val="left" w:pos="6480"/>
+          <w:tab w:val="left" w:pos="7200"/>
+          <w:tab w:val="left" w:pos="7920"/>
+          <w:tab w:val="left" w:pos="8640"/>
+        </w:tabs>
+        <w:autoSpaceDE w:val="0"/>
+        <w:autoSpaceDN w:val="0"/>
+        <w:adjustRightInd w:val="0"/>
+        <w:spacing w:after="0" w:line="240" w:lineRule="auto"/>
+        <w:rPr>
+          <w:rFonts w:ascii="Helvetica" w:hAnsi="Helvetica" w:cs="Helvetica"/>
+          <w:kern w:val="0"/>
+        </w:rPr>
+      </w:pPr>
+    </w:p>
+    <w:p>
+      <w:pPr>
+        <w:tabs>
+          <w:tab w:val="left" w:pos="720"/>
+          <w:tab w:val="left" w:pos="1440"/>
+          <w:tab w:val="left" w:pos="2160"/>
+          <w:tab w:val="left" w:pos="2880"/>
+          <w:tab w:val="left" w:pos="3600"/>
+          <w:tab w:val="left" w:pos="4320"/>
+          <w:tab w:val="left" w:pos="5040"/>
+          <w:tab w:val="left" w:pos="5760"/>
+          <w:tab w:val="left" w:pos="6480"/>
+          <w:tab w:val="left" w:pos="7200"/>
+          <w:tab w:val="left" w:pos="7920"/>
+          <w:tab w:val="left" w:pos="8640"/>
+        </w:tabs>
+        <w:autoSpaceDE w:val="0"/>
+        <w:autoSpaceDN w:val="0"/>
+        <w:adjustRightInd w:val="0"/>
+        <w:spacing w:after="0" w:line="240" w:lineRule="auto"/>
+        <w:rPr>
+          <w:rFonts w:ascii="Helvetica" w:hAnsi="Helvetica" w:cs="Helvetica"/>
+          <w:kern w:val="0"/>
+        </w:rPr>
+      </w:pPr>
+    </w:p>
+    <w:p>
+      <w:pPr>
+        <w:tabs>
+          <w:tab w:val="left" w:pos="720"/>
+          <w:tab w:val="left" w:pos="1440"/>
+          <w:tab w:val="left" w:pos="2160"/>
+          <w:tab w:val="left" w:pos="2880"/>
+          <w:tab w:val="left" w:pos="3600"/>
+          <w:tab w:val="left" w:pos="4320"/>
+          <w:tab w:val="left" w:pos="5040"/>
+          <w:tab w:val="left" w:pos="5760"/>
+          <w:tab w:val="left" w:pos="6480"/>
+          <w:tab w:val="left" w:pos="7200"/>
+          <w:tab w:val="left" w:pos="7920"/>
+          <w:tab w:val="left" w:pos="8640"/>
+        </w:tabs>
+        <w:autoSpaceDE w:val="0"/>
+        <w:autoSpaceDN w:val="0"/>
+        <w:adjustRightInd w:val="0"/>
+        <w:spacing w:after="0" w:line="240" w:lineRule="auto"/>
+        <w:rPr>
+          <w:rFonts w:ascii="Helvetica" w:hAnsi="Helvetica" w:cs="Helvetica"/>
+          <w:kern w:val="0"/>
+        </w:rPr>
+      </w:pPr>
+      <w:r>
+        <w:rPr>
+          <w:rFonts w:ascii="Helvetica" w:hAnsi="Helvetica" w:cs="Helvetica"/>
+          <w:kern w:val="0"/>
+        </w:rPr>
+        <w:t xml:space="preserve">We need to write a validation function for the results of </w:t>
+      </w:r>
+      <w:proofErr w:type="spellStart"/>
+      <w:r>
+        <w:rPr>
+          <w:rFonts w:ascii="Helvetica" w:hAnsi="Helvetica" w:cs="Helvetica"/>
+          <w:kern w:val="0"/>
+        </w:rPr>
+        <w:t>detect_patterns</w:t>
+      </w:r>
+      <w:proofErr w:type="spellEnd"/>
+      <w:r>
+        <w:rPr>
+          <w:rFonts w:ascii="Helvetica" w:hAnsi="Helvetica" w:cs="Helvetica"/>
+          <w:kern w:val="0"/>
+        </w:rPr>
+        <w:t xml:space="preserve">. In other words. Take </w:t>
+      </w:r>
+      <w:proofErr w:type="spellStart"/>
+      <w:r>
+        <w:rPr>
+          <w:rFonts w:ascii="Helvetica" w:hAnsi="Helvetica" w:cs="Helvetica"/>
+          <w:kern w:val="0"/>
+        </w:rPr>
+        <w:t>res.</w:t>
+      </w:r>
+      <w:r>
+        <w:rPr>
+          <w:rFonts w:ascii="Helvetica" w:hAnsi="Helvetica" w:cs="Helvetica"/>
+          <w:kern w:val="0"/>
+        </w:rPr>
+        <w:t>mapped_result</w:t>
+      </w:r>
+      <w:proofErr w:type="spellEnd"/>
+      <w:r>
+        <w:rPr>
+          <w:rFonts w:ascii="Helvetica" w:hAnsi="Helvetica" w:cs="Helvetica"/>
+          <w:kern w:val="0"/>
+        </w:rPr>
+        <w:t xml:space="preserve"> </w:t>
+      </w:r>
+      <w:r>
+        <w:rPr>
+          <w:rFonts w:ascii="Helvetica" w:hAnsi="Helvetica" w:cs="Helvetica"/>
+          <w:kern w:val="0"/>
+        </w:rPr>
+        <w:t xml:space="preserve">and check directness and </w:t>
+      </w:r>
+      <w:r>
+        <w:rPr>
+          <w:rFonts w:ascii="Helvetica" w:hAnsi="Helvetica" w:cs="Helvetica"/>
+          <w:kern w:val="0"/>
+        </w:rPr>
+        <w:t>palindrome status.</w:t>
+      </w:r>
+    </w:p>
+    <w:p>
+      <w:pPr>
+        <w:tabs>
+          <w:tab w:val="left" w:pos="720"/>
+          <w:tab w:val="left" w:pos="1440"/>
+          <w:tab w:val="left" w:pos="2160"/>
+          <w:tab w:val="left" w:pos="2880"/>
+          <w:tab w:val="left" w:pos="3600"/>
+          <w:tab w:val="left" w:pos="4320"/>
+          <w:tab w:val="left" w:pos="5040"/>
+          <w:tab w:val="left" w:pos="5760"/>
+          <w:tab w:val="left" w:pos="6480"/>
+          <w:tab w:val="left" w:pos="7200"/>
+          <w:tab w:val="left" w:pos="7920"/>
+          <w:tab w:val="left" w:pos="8640"/>
+        </w:tabs>
+        <w:autoSpaceDE w:val="0"/>
+        <w:autoSpaceDN w:val="0"/>
+        <w:adjustRightInd w:val="0"/>
+        <w:spacing w:after="0" w:line="240" w:lineRule="auto"/>
+        <w:rPr>
+          <w:rFonts w:ascii="Helvetica" w:hAnsi="Helvetica" w:cs="Helvetica"/>
+          <w:kern w:val="0"/>
+        </w:rPr>
+      </w:pPr>
+    </w:p>
+    <w:p>
+      <w:pPr>
+        <w:tabs>
+          <w:tab w:val="left" w:pos="720"/>
+          <w:tab w:val="left" w:pos="1440"/>
+          <w:tab w:val="left" w:pos="2160"/>
+          <w:tab w:val="left" w:pos="2880"/>
+          <w:tab w:val="left" w:pos="3600"/>
+          <w:tab w:val="left" w:pos="4320"/>
+          <w:tab w:val="left" w:pos="5040"/>
+          <w:tab w:val="left" w:pos="5760"/>
+          <w:tab w:val="left" w:pos="6480"/>
+          <w:tab w:val="left" w:pos="7200"/>
+          <w:tab w:val="left" w:pos="7920"/>
+          <w:tab w:val="left" w:pos="8640"/>
+        </w:tabs>
+        <w:autoSpaceDE w:val="0"/>
+        <w:autoSpaceDN w:val="0"/>
+        <w:adjustRightInd w:val="0"/>
+        <w:spacing w:after="0" w:line="240" w:lineRule="auto"/>
+        <w:rPr>
+          <w:rFonts w:ascii="Helvetica" w:hAnsi="Helvetica" w:cs="Helvetica"/>
+          <w:kern w:val="0"/>
+        </w:rPr>
+      </w:pPr>
+    </w:p>
+    <w:p>
+      <w:pPr>
+        <w:tabs>
+          <w:tab w:val="left" w:pos="720"/>
+          <w:tab w:val="left" w:pos="1440"/>
+          <w:tab w:val="left" w:pos="2160"/>
+          <w:tab w:val="left" w:pos="2880"/>
+          <w:tab w:val="left" w:pos="3600"/>
+          <w:tab w:val="left" w:pos="4320"/>
+          <w:tab w:val="left" w:pos="5040"/>
+          <w:tab w:val="left" w:pos="5760"/>
+          <w:tab w:val="left" w:pos="6480"/>
+          <w:tab w:val="left" w:pos="7200"/>
+          <w:tab w:val="left" w:pos="7920"/>
+          <w:tab w:val="left" w:pos="8640"/>
+        </w:tabs>
+        <w:autoSpaceDE w:val="0"/>
+        <w:autoSpaceDN w:val="0"/>
+        <w:adjustRightInd w:val="0"/>
+        <w:spacing w:after="0" w:line="240" w:lineRule="auto"/>
+        <w:rPr>
+          <w:rFonts w:ascii="Helvetica" w:hAnsi="Helvetica" w:cs="Helvetica"/>
+          <w:kern w:val="0"/>
+        </w:rPr>
+      </w:pPr>
+    </w:p>
+    <w:p>
+      <w:pPr>
+        <w:tabs>
+          <w:tab w:val="left" w:pos="720"/>
+          <w:tab w:val="left" w:pos="1440"/>
+          <w:tab w:val="left" w:pos="2160"/>
+          <w:tab w:val="left" w:pos="2880"/>
+          <w:tab w:val="left" w:pos="3600"/>
+          <w:tab w:val="left" w:pos="4320"/>
+          <w:tab w:val="left" w:pos="5040"/>
+          <w:tab w:val="left" w:pos="5760"/>
+          <w:tab w:val="left" w:pos="6480"/>
+          <w:tab w:val="left" w:pos="7200"/>
+          <w:tab w:val="left" w:pos="7920"/>
+          <w:tab w:val="left" w:pos="8640"/>
+        </w:tabs>
+        <w:autoSpaceDE w:val="0"/>
+        <w:autoSpaceDN w:val="0"/>
+        <w:adjustRightInd w:val="0"/>
+        <w:spacing w:after="0" w:line="240" w:lineRule="auto"/>
+        <w:rPr>
+          <w:rFonts w:ascii="Helvetica" w:hAnsi="Helvetica" w:cs="Helvetica"/>
+          <w:kern w:val="0"/>
+        </w:rPr>
+      </w:pPr>
+    </w:p>
+    <w:p>
+      <w:pPr>
+        <w:tabs>
+          <w:tab w:val="left" w:pos="720"/>
+          <w:tab w:val="left" w:pos="1440"/>
+          <w:tab w:val="left" w:pos="2160"/>
+          <w:tab w:val="left" w:pos="2880"/>
+          <w:tab w:val="left" w:pos="3600"/>
+          <w:tab w:val="left" w:pos="4320"/>
+          <w:tab w:val="left" w:pos="5040"/>
+          <w:tab w:val="left" w:pos="5760"/>
+          <w:tab w:val="left" w:pos="6480"/>
+          <w:tab w:val="left" w:pos="7200"/>
+          <w:tab w:val="left" w:pos="7920"/>
+          <w:tab w:val="left" w:pos="8640"/>
+        </w:tabs>
+        <w:autoSpaceDE w:val="0"/>
+        <w:autoSpaceDN w:val="0"/>
+        <w:adjustRightInd w:val="0"/>
+        <w:spacing w:after="0" w:line="240" w:lineRule="auto"/>
+        <w:rPr>
+          <w:rFonts w:ascii="Helvetica" w:hAnsi="Helvetica" w:cs="Helvetica"/>
+          <w:kern w:val="0"/>
+        </w:rPr>
+      </w:pPr>
+    </w:p>
+    <w:p>
+      <w:pPr>
+        <w:tabs>
+          <w:tab w:val="left" w:pos="720"/>
+          <w:tab w:val="left" w:pos="1440"/>
+          <w:tab w:val="left" w:pos="2160"/>
+          <w:tab w:val="left" w:pos="2880"/>
+          <w:tab w:val="left" w:pos="3600"/>
+          <w:tab w:val="left" w:pos="4320"/>
+          <w:tab w:val="left" w:pos="5040"/>
+          <w:tab w:val="left" w:pos="5760"/>
+          <w:tab w:val="left" w:pos="6480"/>
+          <w:tab w:val="left" w:pos="7200"/>
+          <w:tab w:val="left" w:pos="7920"/>
+          <w:tab w:val="left" w:pos="8640"/>
+        </w:tabs>
+        <w:autoSpaceDE w:val="0"/>
+        <w:autoSpaceDN w:val="0"/>
+        <w:adjustRightInd w:val="0"/>
+        <w:spacing w:after="0" w:line="240" w:lineRule="auto"/>
+        <w:rPr>
+          <w:rFonts w:ascii="Helvetica" w:hAnsi="Helvetica" w:cs="Helvetica"/>
+          <w:kern w:val="0"/>
+        </w:rPr>
+      </w:pPr>
+    </w:p>
+    <w:p>
+      <w:pPr>
+        <w:tabs>
+          <w:tab w:val="left" w:pos="720"/>
+          <w:tab w:val="left" w:pos="1440"/>
+          <w:tab w:val="left" w:pos="2160"/>
+          <w:tab w:val="left" w:pos="2880"/>
+          <w:tab w:val="left" w:pos="3600"/>
+          <w:tab w:val="left" w:pos="4320"/>
+          <w:tab w:val="left" w:pos="5040"/>
+          <w:tab w:val="left" w:pos="5760"/>
+          <w:tab w:val="left" w:pos="6480"/>
+          <w:tab w:val="left" w:pos="7200"/>
+          <w:tab w:val="left" w:pos="7920"/>
+          <w:tab w:val="left" w:pos="8640"/>
+        </w:tabs>
+        <w:autoSpaceDE w:val="0"/>
+        <w:autoSpaceDN w:val="0"/>
+        <w:adjustRightInd w:val="0"/>
+        <w:spacing w:after="0" w:line="240" w:lineRule="auto"/>
+        <w:rPr>
+          <w:rFonts w:ascii="Helvetica" w:hAnsi="Helvetica" w:cs="Helvetica"/>
+          <w:kern w:val="0"/>
+        </w:rPr>
+      </w:pPr>
+      <w:r>
+        <w:rPr>
+          <w:rFonts w:ascii="Helvetica" w:hAnsi="Helvetica" w:cs="Helvetica"/>
+          <w:kern w:val="0"/>
+        </w:rPr>
+        <w:t>06-06-26</w:t>
+      </w:r>
+    </w:p>
+    <w:p>
+      <w:pPr>
+        <w:tabs>
+          <w:tab w:val="left" w:pos="720"/>
+          <w:tab w:val="left" w:pos="1440"/>
+          <w:tab w:val="left" w:pos="2160"/>
+          <w:tab w:val="left" w:pos="2880"/>
+          <w:tab w:val="left" w:pos="3600"/>
+          <w:tab w:val="left" w:pos="4320"/>
+          <w:tab w:val="left" w:pos="5040"/>
+          <w:tab w:val="left" w:pos="5760"/>
+          <w:tab w:val="left" w:pos="6480"/>
+          <w:tab w:val="left" w:pos="7200"/>
+          <w:tab w:val="left" w:pos="7920"/>
+          <w:tab w:val="left" w:pos="8640"/>
+        </w:tabs>
+        <w:autoSpaceDE w:val="0"/>
+        <w:autoSpaceDN w:val="0"/>
+        <w:adjustRightInd w:val="0"/>
+        <w:spacing w:after="0" w:line="240" w:lineRule="auto"/>
+        <w:rPr>
+          <w:rFonts w:ascii="Helvetica" w:hAnsi="Helvetica" w:cs="Helvetica"/>
+          <w:kern w:val="0"/>
+        </w:rPr>
+      </w:pPr>
+    </w:p>
+    <w:p>
+      <w:pPr>
+        <w:tabs>
+          <w:tab w:val="left" w:pos="720"/>
+          <w:tab w:val="left" w:pos="1440"/>
+          <w:tab w:val="left" w:pos="2160"/>
+          <w:tab w:val="left" w:pos="2880"/>
+          <w:tab w:val="left" w:pos="3600"/>
+          <w:tab w:val="left" w:pos="4320"/>
+          <w:tab w:val="left" w:pos="5040"/>
+          <w:tab w:val="left" w:pos="5760"/>
+          <w:tab w:val="left" w:pos="6480"/>
+          <w:tab w:val="left" w:pos="7200"/>
+          <w:tab w:val="left" w:pos="7920"/>
+          <w:tab w:val="left" w:pos="8640"/>
+        </w:tabs>
+        <w:autoSpaceDE w:val="0"/>
+        <w:autoSpaceDN w:val="0"/>
+        <w:adjustRightInd w:val="0"/>
+        <w:spacing w:after="0" w:line="240" w:lineRule="auto"/>
+        <w:rPr>
+          <w:rFonts w:ascii="Helvetica" w:hAnsi="Helvetica" w:cs="Helvetica"/>
+          <w:kern w:val="0"/>
+        </w:rPr>
+      </w:pPr>
+      <w:r>
+        <w:rPr>
+          <w:rFonts w:ascii="Helvetica" w:hAnsi="Helvetica" w:cs="Helvetica"/>
+          <w:kern w:val="0"/>
+        </w:rPr>
+        <w:t>we now have a collection of folders called</w:t>
+      </w:r>
+    </w:p>
+    <w:p>
+      <w:pPr>
+        <w:tabs>
+          <w:tab w:val="left" w:pos="720"/>
+          <w:tab w:val="left" w:pos="1440"/>
+          <w:tab w:val="left" w:pos="2160"/>
+          <w:tab w:val="left" w:pos="2880"/>
+          <w:tab w:val="left" w:pos="3600"/>
+          <w:tab w:val="left" w:pos="4320"/>
+          <w:tab w:val="left" w:pos="5040"/>
+          <w:tab w:val="left" w:pos="5760"/>
+          <w:tab w:val="left" w:pos="6480"/>
+          <w:tab w:val="left" w:pos="7200"/>
+          <w:tab w:val="left" w:pos="7920"/>
+          <w:tab w:val="left" w:pos="8640"/>
+        </w:tabs>
+        <w:autoSpaceDE w:val="0"/>
+        <w:autoSpaceDN w:val="0"/>
+        <w:adjustRightInd w:val="0"/>
+        <w:spacing w:after="0" w:line="240" w:lineRule="auto"/>
+        <w:rPr>
+          <w:rFonts w:ascii="Helvetica" w:hAnsi="Helvetica" w:cs="Helvetica"/>
+          <w:kern w:val="0"/>
+        </w:rPr>
+      </w:pPr>
+      <w:proofErr w:type="spellStart"/>
+      <w:r>
+        <w:rPr>
+          <w:rFonts w:ascii="Helvetica" w:hAnsi="Helvetica" w:cs="Helvetica"/>
+          <w:kern w:val="0"/>
+        </w:rPr>
+        <w:t>XX_Threshold_OUTPUT_REPORT</w:t>
+      </w:r>
+      <w:proofErr w:type="spellEnd"/>
+    </w:p>
+    <w:p>
+      <w:pPr>
+        <w:tabs>
+          <w:tab w:val="left" w:pos="720"/>
+          <w:tab w:val="left" w:pos="1440"/>
+          <w:tab w:val="left" w:pos="2160"/>
+          <w:tab w:val="left" w:pos="2880"/>
+          <w:tab w:val="left" w:pos="3600"/>
+          <w:tab w:val="left" w:pos="4320"/>
+          <w:tab w:val="left" w:pos="5040"/>
+          <w:tab w:val="left" w:pos="5760"/>
+          <w:tab w:val="left" w:pos="6480"/>
+          <w:tab w:val="left" w:pos="7200"/>
+          <w:tab w:val="left" w:pos="7920"/>
+          <w:tab w:val="left" w:pos="8640"/>
+        </w:tabs>
+        <w:autoSpaceDE w:val="0"/>
+        <w:autoSpaceDN w:val="0"/>
+        <w:adjustRightInd w:val="0"/>
+        <w:spacing w:after="0" w:line="240" w:lineRule="auto"/>
+        <w:rPr>
+          <w:rFonts w:ascii="Helvetica" w:hAnsi="Helvetica" w:cs="Helvetica"/>
+          <w:kern w:val="0"/>
+        </w:rPr>
+      </w:pPr>
+      <w:r>
+        <w:rPr>
+          <w:rFonts w:ascii="Helvetica" w:hAnsi="Helvetica" w:cs="Helvetica"/>
+          <w:kern w:val="0"/>
+        </w:rPr>
+        <w:t>Where XX ranges from 0 to 90 in increments of 10.</w:t>
+      </w:r>
+    </w:p>
+    <w:p>
+      <w:pPr>
+        <w:tabs>
+          <w:tab w:val="left" w:pos="720"/>
+          <w:tab w:val="left" w:pos="1440"/>
+          <w:tab w:val="left" w:pos="2160"/>
+          <w:tab w:val="left" w:pos="2880"/>
+          <w:tab w:val="left" w:pos="3600"/>
+          <w:tab w:val="left" w:pos="4320"/>
+          <w:tab w:val="left" w:pos="5040"/>
+          <w:tab w:val="left" w:pos="5760"/>
+          <w:tab w:val="left" w:pos="6480"/>
+          <w:tab w:val="left" w:pos="7200"/>
+          <w:tab w:val="left" w:pos="7920"/>
+          <w:tab w:val="left" w:pos="8640"/>
+        </w:tabs>
+        <w:autoSpaceDE w:val="0"/>
+        <w:autoSpaceDN w:val="0"/>
+        <w:adjustRightInd w:val="0"/>
+        <w:spacing w:after="0" w:line="240" w:lineRule="auto"/>
+        <w:rPr>
+          <w:rFonts w:ascii="Helvetica" w:hAnsi="Helvetica" w:cs="Helvetica"/>
+          <w:kern w:val="0"/>
+        </w:rPr>
+      </w:pPr>
+      <w:r>
+        <w:rPr>
+          <w:rFonts w:ascii="Helvetica" w:hAnsi="Helvetica" w:cs="Helvetica"/>
+          <w:kern w:val="0"/>
+        </w:rPr>
+        <w:t xml:space="preserve">In each folder, there is a report </w:t>
+      </w:r>
+      <w:proofErr w:type="spellStart"/>
+      <w:r>
+        <w:rPr>
+          <w:rFonts w:ascii="Helvetica" w:hAnsi="Helvetica" w:cs="Helvetica"/>
+          <w:kern w:val="0"/>
+        </w:rPr>
+        <w:t>datat</w:t>
+      </w:r>
+      <w:proofErr w:type="spellEnd"/>
+      <w:r>
+        <w:rPr>
+          <w:rFonts w:ascii="Helvetica" w:hAnsi="Helvetica" w:cs="Helvetica"/>
+          <w:kern w:val="0"/>
+        </w:rPr>
+        <w:t xml:space="preserve"> Excel spreadsheet called XX_report_data.xlsx</w:t>
+      </w:r>
+    </w:p>
+    <w:p>
+      <w:pPr>
+        <w:tabs>
+          <w:tab w:val="left" w:pos="720"/>
+          <w:tab w:val="left" w:pos="1440"/>
+          <w:tab w:val="left" w:pos="2160"/>
+          <w:tab w:val="left" w:pos="2880"/>
+          <w:tab w:val="left" w:pos="3600"/>
+          <w:tab w:val="left" w:pos="4320"/>
+          <w:tab w:val="left" w:pos="5040"/>
+          <w:tab w:val="left" w:pos="5760"/>
+          <w:tab w:val="left" w:pos="6480"/>
+          <w:tab w:val="left" w:pos="7200"/>
+          <w:tab w:val="left" w:pos="7920"/>
+          <w:tab w:val="left" w:pos="8640"/>
+        </w:tabs>
+        <w:autoSpaceDE w:val="0"/>
+        <w:autoSpaceDN w:val="0"/>
+        <w:adjustRightInd w:val="0"/>
+        <w:spacing w:after="0" w:line="240" w:lineRule="auto"/>
+        <w:rPr>
+          <w:rFonts w:ascii="Helvetica" w:hAnsi="Helvetica" w:cs="Helvetica"/>
+          <w:kern w:val="0"/>
+        </w:rPr>
+      </w:pPr>
+      <w:r>
+        <w:rPr>
+          <w:rFonts w:ascii="Helvetica" w:hAnsi="Helvetica" w:cs="Helvetica"/>
+          <w:kern w:val="0"/>
+        </w:rPr>
+        <w:t>I want to iteratively analyze the Execution Time (s), but I want to group it by the observations defined by each combination of these fields in the spreadsheets:</w:t>
+      </w:r>
+    </w:p>
+    <w:p>
+      <w:pPr>
+        <w:tabs>
+          <w:tab w:val="left" w:pos="720"/>
+          <w:tab w:val="left" w:pos="1440"/>
+          <w:tab w:val="left" w:pos="2160"/>
+          <w:tab w:val="left" w:pos="2880"/>
+          <w:tab w:val="left" w:pos="3600"/>
+          <w:tab w:val="left" w:pos="4320"/>
+          <w:tab w:val="left" w:pos="5040"/>
+          <w:tab w:val="left" w:pos="5760"/>
+          <w:tab w:val="left" w:pos="6480"/>
+          <w:tab w:val="left" w:pos="7200"/>
+          <w:tab w:val="left" w:pos="7920"/>
+          <w:tab w:val="left" w:pos="8640"/>
+        </w:tabs>
+        <w:autoSpaceDE w:val="0"/>
+        <w:autoSpaceDN w:val="0"/>
+        <w:adjustRightInd w:val="0"/>
+        <w:spacing w:after="0" w:line="240" w:lineRule="auto"/>
+        <w:rPr>
+          <w:rFonts w:ascii="Helvetica" w:hAnsi="Helvetica" w:cs="Helvetica"/>
+          <w:kern w:val="0"/>
+        </w:rPr>
+      </w:pPr>
+    </w:p>
+    <w:p>
+      <w:pPr>
+        <w:tabs>
+          <w:tab w:val="left" w:pos="720"/>
+          <w:tab w:val="left" w:pos="1440"/>
+          <w:tab w:val="left" w:pos="2160"/>
+          <w:tab w:val="left" w:pos="2880"/>
+          <w:tab w:val="left" w:pos="3600"/>
+          <w:tab w:val="left" w:pos="4320"/>
+          <w:tab w:val="left" w:pos="5040"/>
+          <w:tab w:val="left" w:pos="5760"/>
+          <w:tab w:val="left" w:pos="6480"/>
+          <w:tab w:val="left" w:pos="7200"/>
+          <w:tab w:val="left" w:pos="7920"/>
+          <w:tab w:val="left" w:pos="8640"/>
+        </w:tabs>
+        <w:autoSpaceDE w:val="0"/>
+        <w:autoSpaceDN w:val="0"/>
+        <w:adjustRightInd w:val="0"/>
+        <w:spacing w:after="0" w:line="240" w:lineRule="auto"/>
+        <w:rPr>
+          <w:rFonts w:ascii="Helvetica" w:hAnsi="Helvetica" w:cs="Helvetica"/>
+          <w:kern w:val="0"/>
+        </w:rPr>
+      </w:pPr>
+      <w:r>
+        <w:rPr>
+          <w:rFonts w:ascii="Helvetica" w:hAnsi="Helvetica" w:cs="Helvetica"/>
+          <w:kern w:val="0"/>
+        </w:rPr>
+        <w:t>Family</w:t>
+      </w:r>
+    </w:p>
+    <w:p>
+      <w:pPr>
+        <w:tabs>
+          <w:tab w:val="left" w:pos="720"/>
+          <w:tab w:val="left" w:pos="1440"/>
+          <w:tab w:val="left" w:pos="2160"/>
+          <w:tab w:val="left" w:pos="2880"/>
+          <w:tab w:val="left" w:pos="3600"/>
+          <w:tab w:val="left" w:pos="4320"/>
+          <w:tab w:val="left" w:pos="5040"/>
+          <w:tab w:val="left" w:pos="5760"/>
+          <w:tab w:val="left" w:pos="6480"/>
+          <w:tab w:val="left" w:pos="7200"/>
+          <w:tab w:val="left" w:pos="7920"/>
+          <w:tab w:val="left" w:pos="8640"/>
+        </w:tabs>
+        <w:autoSpaceDE w:val="0"/>
+        <w:autoSpaceDN w:val="0"/>
+        <w:adjustRightInd w:val="0"/>
+        <w:spacing w:after="0" w:line="240" w:lineRule="auto"/>
+        <w:rPr>
+          <w:rFonts w:ascii="Helvetica" w:hAnsi="Helvetica" w:cs="Helvetica"/>
+          <w:kern w:val="0"/>
+        </w:rPr>
+      </w:pPr>
+      <w:r>
+        <w:rPr>
+          <w:rFonts w:ascii="Helvetica" w:hAnsi="Helvetica" w:cs="Helvetica"/>
+          <w:kern w:val="0"/>
+        </w:rPr>
+        <w:t xml:space="preserve"> Species</w:t>
+      </w:r>
+    </w:p>
+    <w:p>
+      <w:pPr>
+        <w:tabs>
+          <w:tab w:val="left" w:pos="720"/>
+          <w:tab w:val="left" w:pos="1440"/>
+          <w:tab w:val="left" w:pos="2160"/>
+          <w:tab w:val="left" w:pos="2880"/>
+          <w:tab w:val="left" w:pos="3600"/>
+          <w:tab w:val="left" w:pos="4320"/>
+          <w:tab w:val="left" w:pos="5040"/>
+          <w:tab w:val="left" w:pos="5760"/>
+          <w:tab w:val="left" w:pos="6480"/>
+          <w:tab w:val="left" w:pos="7200"/>
+          <w:tab w:val="left" w:pos="7920"/>
+          <w:tab w:val="left" w:pos="8640"/>
+        </w:tabs>
+        <w:autoSpaceDE w:val="0"/>
+        <w:autoSpaceDN w:val="0"/>
+        <w:adjustRightInd w:val="0"/>
+        <w:spacing w:after="0" w:line="240" w:lineRule="auto"/>
+        <w:rPr>
+          <w:rFonts w:ascii="Helvetica" w:hAnsi="Helvetica" w:cs="Helvetica"/>
+          <w:kern w:val="0"/>
+        </w:rPr>
+      </w:pPr>
+      <w:r>
+        <w:rPr>
+          <w:rFonts w:ascii="Helvetica" w:hAnsi="Helvetica" w:cs="Helvetica"/>
+          <w:kern w:val="0"/>
+        </w:rPr>
+        <w:t xml:space="preserve"> Protein</w:t>
+      </w:r>
+    </w:p>
+    <w:p>
+      <w:pPr>
+        <w:tabs>
+          <w:tab w:val="left" w:pos="720"/>
+          <w:tab w:val="left" w:pos="1440"/>
+          <w:tab w:val="left" w:pos="2160"/>
+          <w:tab w:val="left" w:pos="2880"/>
+          <w:tab w:val="left" w:pos="3600"/>
+          <w:tab w:val="left" w:pos="4320"/>
+          <w:tab w:val="left" w:pos="5040"/>
+          <w:tab w:val="left" w:pos="5760"/>
+          <w:tab w:val="left" w:pos="6480"/>
+          <w:tab w:val="left" w:pos="7200"/>
+          <w:tab w:val="left" w:pos="7920"/>
+          <w:tab w:val="left" w:pos="8640"/>
+        </w:tabs>
+        <w:autoSpaceDE w:val="0"/>
+        <w:autoSpaceDN w:val="0"/>
+        <w:adjustRightInd w:val="0"/>
+        <w:spacing w:after="0" w:line="240" w:lineRule="auto"/>
+        <w:rPr>
+          <w:rFonts w:ascii="Helvetica" w:hAnsi="Helvetica" w:cs="Helvetica"/>
+          <w:kern w:val="0"/>
+        </w:rPr>
+      </w:pPr>
+      <w:r>
+        <w:rPr>
+          <w:rFonts w:ascii="Helvetica" w:hAnsi="Helvetica" w:cs="Helvetica"/>
+          <w:kern w:val="0"/>
+        </w:rPr>
+        <w:lastRenderedPageBreak/>
+        <w:t xml:space="preserve"> </w:t>
+      </w:r>
+      <w:proofErr w:type="spellStart"/>
+      <w:r>
+        <w:rPr>
+          <w:rFonts w:ascii="Helvetica" w:hAnsi="Helvetica" w:cs="Helvetica"/>
+          <w:kern w:val="0"/>
+        </w:rPr>
+        <w:t>UniProt</w:t>
+      </w:r>
+      <w:proofErr w:type="spellEnd"/>
+      <w:r>
+        <w:rPr>
+          <w:rFonts w:ascii="Helvetica" w:hAnsi="Helvetica" w:cs="Helvetica"/>
+          <w:kern w:val="0"/>
+        </w:rPr>
+        <w:t xml:space="preserve"> ID</w:t>
+      </w:r>
+    </w:p>
+    <w:p>
+      <w:pPr>
+        <w:tabs>
+          <w:tab w:val="left" w:pos="720"/>
+          <w:tab w:val="left" w:pos="1440"/>
+          <w:tab w:val="left" w:pos="2160"/>
+          <w:tab w:val="left" w:pos="2880"/>
+          <w:tab w:val="left" w:pos="3600"/>
+          <w:tab w:val="left" w:pos="4320"/>
+          <w:tab w:val="left" w:pos="5040"/>
+          <w:tab w:val="left" w:pos="5760"/>
+          <w:tab w:val="left" w:pos="6480"/>
+          <w:tab w:val="left" w:pos="7200"/>
+          <w:tab w:val="left" w:pos="7920"/>
+          <w:tab w:val="left" w:pos="8640"/>
+        </w:tabs>
+        <w:autoSpaceDE w:val="0"/>
+        <w:autoSpaceDN w:val="0"/>
+        <w:adjustRightInd w:val="0"/>
+        <w:spacing w:after="0" w:line="240" w:lineRule="auto"/>
+        <w:rPr>
+          <w:rFonts w:ascii="Helvetica" w:hAnsi="Helvetica" w:cs="Helvetica"/>
+          <w:kern w:val="0"/>
+        </w:rPr>
+      </w:pPr>
+      <w:r>
+        <w:rPr>
+          <w:rFonts w:ascii="Helvetica" w:hAnsi="Helvetica" w:cs="Helvetica"/>
+          <w:kern w:val="0"/>
+        </w:rPr>
+        <w:t xml:space="preserve"> Analyzed Direction</w:t>
+      </w:r>
+    </w:p>
+    <w:p>
+      <w:pPr>
+        <w:tabs>
+          <w:tab w:val="left" w:pos="720"/>
+          <w:tab w:val="left" w:pos="1440"/>
+          <w:tab w:val="left" w:pos="2160"/>
+          <w:tab w:val="left" w:pos="2880"/>
+          <w:tab w:val="left" w:pos="3600"/>
+          <w:tab w:val="left" w:pos="4320"/>
+          <w:tab w:val="left" w:pos="5040"/>
+          <w:tab w:val="left" w:pos="5760"/>
+          <w:tab w:val="left" w:pos="6480"/>
+          <w:tab w:val="left" w:pos="7200"/>
+          <w:tab w:val="left" w:pos="7920"/>
+          <w:tab w:val="left" w:pos="8640"/>
+        </w:tabs>
+        <w:autoSpaceDE w:val="0"/>
+        <w:autoSpaceDN w:val="0"/>
+        <w:adjustRightInd w:val="0"/>
+        <w:spacing w:after="0" w:line="240" w:lineRule="auto"/>
+        <w:rPr>
+          <w:rFonts w:ascii="Helvetica" w:hAnsi="Helvetica" w:cs="Helvetica"/>
+          <w:kern w:val="0"/>
+        </w:rPr>
+      </w:pPr>
+    </w:p>
+    <w:p>
+      <w:pPr>
+        <w:tabs>
+          <w:tab w:val="left" w:pos="720"/>
+          <w:tab w:val="left" w:pos="1440"/>
+          <w:tab w:val="left" w:pos="2160"/>
+          <w:tab w:val="left" w:pos="2880"/>
+          <w:tab w:val="left" w:pos="3600"/>
+          <w:tab w:val="left" w:pos="4320"/>
+          <w:tab w:val="left" w:pos="5040"/>
+          <w:tab w:val="left" w:pos="5760"/>
+          <w:tab w:val="left" w:pos="6480"/>
+          <w:tab w:val="left" w:pos="7200"/>
+          <w:tab w:val="left" w:pos="7920"/>
+          <w:tab w:val="left" w:pos="8640"/>
+        </w:tabs>
+        <w:autoSpaceDE w:val="0"/>
+        <w:autoSpaceDN w:val="0"/>
+        <w:adjustRightInd w:val="0"/>
+        <w:spacing w:after="0" w:line="240" w:lineRule="auto"/>
+        <w:rPr>
+          <w:rFonts w:ascii="Helvetica" w:hAnsi="Helvetica" w:cs="Helvetica"/>
+          <w:kern w:val="0"/>
+        </w:rPr>
+      </w:pPr>
+      <w:r>
+        <w:rPr>
+          <w:rFonts w:ascii="Helvetica" w:hAnsi="Helvetica" w:cs="Helvetica"/>
+          <w:kern w:val="0"/>
+        </w:rPr>
+        <w:t>In the end, the desired output is a chart and table that shows the threshold XX and the average amount of execution time across all the unique observations.</w:t>
+      </w:r>
+    </w:p>
+    <w:p>
+      <w:pPr>
+        <w:tabs>
+          <w:tab w:val="left" w:pos="720"/>
+          <w:tab w:val="left" w:pos="1440"/>
+          <w:tab w:val="left" w:pos="2160"/>
+          <w:tab w:val="left" w:pos="2880"/>
+          <w:tab w:val="left" w:pos="3600"/>
+          <w:tab w:val="left" w:pos="4320"/>
+          <w:tab w:val="left" w:pos="5040"/>
+          <w:tab w:val="left" w:pos="5760"/>
+          <w:tab w:val="left" w:pos="6480"/>
+          <w:tab w:val="left" w:pos="7200"/>
+          <w:tab w:val="left" w:pos="7920"/>
+          <w:tab w:val="left" w:pos="8640"/>
+        </w:tabs>
+        <w:autoSpaceDE w:val="0"/>
+        <w:autoSpaceDN w:val="0"/>
+        <w:adjustRightInd w:val="0"/>
+        <w:spacing w:after="0" w:line="240" w:lineRule="auto"/>
+        <w:rPr>
+          <w:rFonts w:ascii="Helvetica" w:hAnsi="Helvetica" w:cs="Helvetica"/>
+          <w:kern w:val="0"/>
+        </w:rPr>
+      </w:pPr>
+    </w:p>
+    <w:p>
+      <w:pPr>
+        <w:tabs>
+          <w:tab w:val="left" w:pos="720"/>
+          <w:tab w:val="left" w:pos="1440"/>
+          <w:tab w:val="left" w:pos="2160"/>
+          <w:tab w:val="left" w:pos="2880"/>
+          <w:tab w:val="left" w:pos="3600"/>
+          <w:tab w:val="left" w:pos="4320"/>
+          <w:tab w:val="left" w:pos="5040"/>
+          <w:tab w:val="left" w:pos="5760"/>
+          <w:tab w:val="left" w:pos="6480"/>
+          <w:tab w:val="left" w:pos="7200"/>
+          <w:tab w:val="left" w:pos="7920"/>
+          <w:tab w:val="left" w:pos="8640"/>
+        </w:tabs>
+        <w:autoSpaceDE w:val="0"/>
+        <w:autoSpaceDN w:val="0"/>
+        <w:adjustRightInd w:val="0"/>
+        <w:spacing w:after="0" w:line="240" w:lineRule="auto"/>
+        <w:rPr>
+          <w:rFonts w:ascii="Helvetica" w:hAnsi="Helvetica" w:cs="Helvetica"/>
+          <w:kern w:val="0"/>
+        </w:rPr>
+      </w:pPr>
+    </w:p>
+    <w:p>
+      <w:pPr>
+        <w:tabs>
+          <w:tab w:val="left" w:pos="720"/>
+          <w:tab w:val="left" w:pos="1440"/>
+          <w:tab w:val="left" w:pos="2160"/>
+          <w:tab w:val="left" w:pos="2880"/>
+          <w:tab w:val="left" w:pos="3600"/>
+          <w:tab w:val="left" w:pos="4320"/>
+          <w:tab w:val="left" w:pos="5040"/>
+          <w:tab w:val="left" w:pos="5760"/>
+          <w:tab w:val="left" w:pos="6480"/>
+          <w:tab w:val="left" w:pos="7200"/>
+          <w:tab w:val="left" w:pos="7920"/>
+          <w:tab w:val="left" w:pos="8640"/>
+        </w:tabs>
+        <w:autoSpaceDE w:val="0"/>
+        <w:autoSpaceDN w:val="0"/>
+        <w:adjustRightInd w:val="0"/>
+        <w:spacing w:after="0" w:line="240" w:lineRule="auto"/>
+        <w:rPr>
+          <w:rFonts w:ascii="Helvetica" w:hAnsi="Helvetica" w:cs="Helvetica"/>
+          <w:kern w:val="0"/>
+        </w:rPr>
+      </w:pPr>
       <w:r>
         <w:rPr>
           <w:rFonts w:ascii="Helvetica" w:hAnsi="Helvetica" w:cs="Helvetica"/>
@@ -97,9 +1450,8 @@
           <w:color w:val="196B24" w:themeColor="accent3"/>
           <w:kern w:val="0"/>
         </w:rPr>
-        <w:t xml:space="preserve">80 — flat </w:t>
-      </w:r>
-      <w:proofErr w:type="gramStart"/>
+        <w:t xml:space="preserve">80 — flat percentile  — across board </w:t>
+      </w:r>
       <w:r>
         <w:rPr>
           <w:rFonts w:ascii="Helvetica" w:hAnsi="Helvetica" w:cs="Helvetica"/>
@@ -108,125 +1460,151 @@
           <w:color w:val="196B24" w:themeColor="accent3"/>
           <w:kern w:val="0"/>
         </w:rPr>
-        <w:t>percentile  —</w:t>
-      </w:r>
-      <w:proofErr w:type="gramEnd"/>
-      <w:r>
-        <w:rPr>
-          <w:rFonts w:ascii="Helvetica" w:hAnsi="Helvetica" w:cs="Helvetica"/>
-          <w:b/>
-          <w:bCs/>
-          <w:color w:val="196B24" w:themeColor="accent3"/>
-          <w:kern w:val="0"/>
-        </w:rPr>
-        <w:t xml:space="preserve"> across </w:t>
-      </w:r>
-      <w:proofErr w:type="gramStart"/>
-      <w:r>
-        <w:rPr>
-          <w:rFonts w:ascii="Helvetica" w:hAnsi="Helvetica" w:cs="Helvetica"/>
-          <w:b/>
-          <w:bCs/>
-          <w:color w:val="196B24" w:themeColor="accent3"/>
-          <w:kern w:val="0"/>
-        </w:rPr>
-        <w:t xml:space="preserve">board </w:t>
-      </w:r>
-      <w:r>
-        <w:rPr>
-          <w:rFonts w:ascii="Helvetica" w:hAnsi="Helvetica" w:cs="Helvetica"/>
-          <w:b/>
-          <w:bCs/>
-          <w:color w:val="196B24" w:themeColor="accent3"/>
-          <w:kern w:val="0"/>
-        </w:rPr>
-        <w:t xml:space="preserve"> --</w:t>
-      </w:r>
-      <w:proofErr w:type="gramEnd"/>
-      <w:r>
-        <w:rPr>
-          <w:rFonts w:ascii="Helvetica" w:hAnsi="Helvetica" w:cs="Helvetica"/>
-          <w:b/>
-          <w:bCs/>
-          <w:color w:val="196B24" w:themeColor="accent3"/>
-          <w:kern w:val="0"/>
-        </w:rPr>
-        <w:t xml:space="preserve"> turn off decrementing, we want a consistent apples-apples comparison  </w:t>
-      </w:r>
-    </w:p>
-    <w:p>
-      <w:pPr>
-        <w:tabs>
-          <w:tab w:val="left" w:pos="720"/>
-          <w:tab w:val="left" w:pos="1440"/>
-          <w:tab w:val="left" w:pos="2160"/>
-          <w:tab w:val="left" w:pos="2880"/>
-          <w:tab w:val="left" w:pos="3600"/>
-          <w:tab w:val="left" w:pos="4320"/>
-          <w:tab w:val="left" w:pos="5040"/>
-          <w:tab w:val="left" w:pos="5760"/>
-          <w:tab w:val="left" w:pos="6480"/>
-          <w:tab w:val="left" w:pos="7200"/>
-          <w:tab w:val="left" w:pos="7920"/>
-          <w:tab w:val="left" w:pos="8640"/>
-        </w:tabs>
-        <w:autoSpaceDE w:val="0"/>
-        <w:autoSpaceDN w:val="0"/>
-        <w:adjustRightInd w:val="0"/>
-        <w:spacing w:after="0" w:line="240" w:lineRule="auto"/>
-        <w:rPr>
-          <w:rFonts w:ascii="Helvetica" w:hAnsi="Helvetica" w:cs="Helvetica"/>
-          <w:kern w:val="0"/>
-        </w:rPr>
-      </w:pPr>
-    </w:p>
-    <w:p>
-      <w:pPr>
-        <w:tabs>
-          <w:tab w:val="left" w:pos="720"/>
-          <w:tab w:val="left" w:pos="1440"/>
-          <w:tab w:val="left" w:pos="2160"/>
-          <w:tab w:val="left" w:pos="2880"/>
-          <w:tab w:val="left" w:pos="3600"/>
-          <w:tab w:val="left" w:pos="4320"/>
-          <w:tab w:val="left" w:pos="5040"/>
-          <w:tab w:val="left" w:pos="5760"/>
-          <w:tab w:val="left" w:pos="6480"/>
-          <w:tab w:val="left" w:pos="7200"/>
-          <w:tab w:val="left" w:pos="7920"/>
-          <w:tab w:val="left" w:pos="8640"/>
-        </w:tabs>
-        <w:autoSpaceDE w:val="0"/>
-        <w:autoSpaceDN w:val="0"/>
-        <w:adjustRightInd w:val="0"/>
-        <w:spacing w:after="0" w:line="240" w:lineRule="auto"/>
-        <w:rPr>
-          <w:rFonts w:ascii="Helvetica" w:hAnsi="Helvetica" w:cs="Helvetica"/>
-          <w:kern w:val="0"/>
-        </w:rPr>
-      </w:pPr>
-      <w:r>
-        <w:rPr>
-          <w:rFonts w:ascii="Helvetica" w:hAnsi="Helvetica" w:cs="Helvetica"/>
-          <w:kern w:val="0"/>
-        </w:rPr>
-        <w:t xml:space="preserve">Add user parameter for minimum diagonal </w:t>
-      </w:r>
-      <w:proofErr w:type="gramStart"/>
-      <w:r>
-        <w:rPr>
-          <w:rFonts w:ascii="Helvetica" w:hAnsi="Helvetica" w:cs="Helvetica"/>
-          <w:kern w:val="0"/>
-        </w:rPr>
-        <w:t>run  —</w:t>
-      </w:r>
-      <w:proofErr w:type="gramEnd"/>
-      <w:r>
-        <w:rPr>
-          <w:rFonts w:ascii="Helvetica" w:hAnsi="Helvetica" w:cs="Helvetica"/>
-          <w:kern w:val="0"/>
-        </w:rPr>
-        <w:t xml:space="preserve"> test for floor of 3 bp </w:t>
+        <w:t xml:space="preserve"> -- turn off decrementing, we want a consistent apples-apples comparison  </w:t>
+      </w:r>
+    </w:p>
+    <w:p>
+      <w:pPr>
+        <w:tabs>
+          <w:tab w:val="left" w:pos="720"/>
+          <w:tab w:val="left" w:pos="1440"/>
+          <w:tab w:val="left" w:pos="2160"/>
+          <w:tab w:val="left" w:pos="2880"/>
+          <w:tab w:val="left" w:pos="3600"/>
+          <w:tab w:val="left" w:pos="4320"/>
+          <w:tab w:val="left" w:pos="5040"/>
+          <w:tab w:val="left" w:pos="5760"/>
+          <w:tab w:val="left" w:pos="6480"/>
+          <w:tab w:val="left" w:pos="7200"/>
+          <w:tab w:val="left" w:pos="7920"/>
+          <w:tab w:val="left" w:pos="8640"/>
+        </w:tabs>
+        <w:autoSpaceDE w:val="0"/>
+        <w:autoSpaceDN w:val="0"/>
+        <w:adjustRightInd w:val="0"/>
+        <w:spacing w:after="0" w:line="240" w:lineRule="auto"/>
+        <w:rPr>
+          <w:rFonts w:ascii="Helvetica" w:hAnsi="Helvetica" w:cs="Helvetica"/>
+          <w:kern w:val="0"/>
+        </w:rPr>
+      </w:pPr>
+    </w:p>
+    <w:p>
+      <w:pPr>
+        <w:tabs>
+          <w:tab w:val="left" w:pos="720"/>
+          <w:tab w:val="left" w:pos="1440"/>
+          <w:tab w:val="left" w:pos="2160"/>
+          <w:tab w:val="left" w:pos="2880"/>
+          <w:tab w:val="left" w:pos="3600"/>
+          <w:tab w:val="left" w:pos="4320"/>
+          <w:tab w:val="left" w:pos="5040"/>
+          <w:tab w:val="left" w:pos="5760"/>
+          <w:tab w:val="left" w:pos="6480"/>
+          <w:tab w:val="left" w:pos="7200"/>
+          <w:tab w:val="left" w:pos="7920"/>
+          <w:tab w:val="left" w:pos="8640"/>
+        </w:tabs>
+        <w:autoSpaceDE w:val="0"/>
+        <w:autoSpaceDN w:val="0"/>
+        <w:adjustRightInd w:val="0"/>
+        <w:spacing w:after="0" w:line="240" w:lineRule="auto"/>
+        <w:rPr>
+          <w:rFonts w:ascii="Helvetica" w:hAnsi="Helvetica" w:cs="Helvetica"/>
+          <w:kern w:val="0"/>
+        </w:rPr>
+      </w:pPr>
+      <w:r>
+        <w:rPr>
+          <w:rFonts w:ascii="Helvetica" w:hAnsi="Helvetica" w:cs="Helvetica"/>
+          <w:kern w:val="0"/>
+        </w:rPr>
+        <w:t xml:space="preserve">Needs to be a module to validate whether a DR is actually a DR and vice versa </w:t>
+      </w:r>
+    </w:p>
+    <w:p>
+      <w:pPr>
+        <w:tabs>
+          <w:tab w:val="left" w:pos="720"/>
+          <w:tab w:val="left" w:pos="1440"/>
+          <w:tab w:val="left" w:pos="2160"/>
+          <w:tab w:val="left" w:pos="2880"/>
+          <w:tab w:val="left" w:pos="3600"/>
+          <w:tab w:val="left" w:pos="4320"/>
+          <w:tab w:val="left" w:pos="5040"/>
+          <w:tab w:val="left" w:pos="5760"/>
+          <w:tab w:val="left" w:pos="6480"/>
+          <w:tab w:val="left" w:pos="7200"/>
+          <w:tab w:val="left" w:pos="7920"/>
+          <w:tab w:val="left" w:pos="8640"/>
+        </w:tabs>
+        <w:autoSpaceDE w:val="0"/>
+        <w:autoSpaceDN w:val="0"/>
+        <w:adjustRightInd w:val="0"/>
+        <w:spacing w:after="0" w:line="240" w:lineRule="auto"/>
+        <w:rPr>
+          <w:rFonts w:ascii="Helvetica" w:hAnsi="Helvetica" w:cs="Helvetica"/>
+          <w:kern w:val="0"/>
+        </w:rPr>
+      </w:pPr>
+    </w:p>
+    <w:p>
+      <w:pPr>
+        <w:tabs>
+          <w:tab w:val="left" w:pos="720"/>
+          <w:tab w:val="left" w:pos="1440"/>
+          <w:tab w:val="left" w:pos="2160"/>
+          <w:tab w:val="left" w:pos="2880"/>
+          <w:tab w:val="left" w:pos="3600"/>
+          <w:tab w:val="left" w:pos="4320"/>
+          <w:tab w:val="left" w:pos="5040"/>
+          <w:tab w:val="left" w:pos="5760"/>
+          <w:tab w:val="left" w:pos="6480"/>
+          <w:tab w:val="left" w:pos="7200"/>
+          <w:tab w:val="left" w:pos="7920"/>
+          <w:tab w:val="left" w:pos="8640"/>
+        </w:tabs>
+        <w:autoSpaceDE w:val="0"/>
+        <w:autoSpaceDN w:val="0"/>
+        <w:adjustRightInd w:val="0"/>
+        <w:spacing w:after="0" w:line="240" w:lineRule="auto"/>
+        <w:rPr>
+          <w:rFonts w:ascii="Helvetica" w:hAnsi="Helvetica" w:cs="Helvetica"/>
+          <w:kern w:val="0"/>
+        </w:rPr>
+      </w:pPr>
+    </w:p>
+    <w:p>
+      <w:pPr>
+        <w:tabs>
+          <w:tab w:val="left" w:pos="720"/>
+          <w:tab w:val="left" w:pos="1440"/>
+          <w:tab w:val="left" w:pos="2160"/>
+          <w:tab w:val="left" w:pos="2880"/>
+          <w:tab w:val="left" w:pos="3600"/>
+          <w:tab w:val="left" w:pos="4320"/>
+          <w:tab w:val="left" w:pos="5040"/>
+          <w:tab w:val="left" w:pos="5760"/>
+          <w:tab w:val="left" w:pos="6480"/>
+          <w:tab w:val="left" w:pos="7200"/>
+          <w:tab w:val="left" w:pos="7920"/>
+          <w:tab w:val="left" w:pos="8640"/>
+        </w:tabs>
+        <w:autoSpaceDE w:val="0"/>
+        <w:autoSpaceDN w:val="0"/>
+        <w:adjustRightInd w:val="0"/>
+        <w:spacing w:after="0" w:line="240" w:lineRule="auto"/>
+        <w:rPr>
+          <w:rFonts w:ascii="Helvetica" w:hAnsi="Helvetica" w:cs="Helvetica"/>
+          <w:kern w:val="0"/>
+        </w:rPr>
+      </w:pPr>
+      <w:r>
+        <w:rPr>
+          <w:rFonts w:ascii="Helvetica" w:hAnsi="Helvetica" w:cs="Helvetica"/>
+          <w:kern w:val="0"/>
+        </w:rPr>
+        <w:t xml:space="preserve">Add user parameter for minimum diagonal run  — test for floor of 3 bp </w:t>
       </w:r>
     </w:p>
     <w:p>
@@ -1077,51 +2455,7 @@
           <w:color w:val="196B24" w:themeColor="accent3"/>
           <w:kern w:val="0"/>
         </w:rPr>
-        <w:t xml:space="preserve">zero p-values = + 1 </w:t>
-      </w:r>
-      <w:proofErr w:type="gramStart"/>
-      <w:r>
-        <w:rPr>
-          <w:rFonts w:ascii="Helvetica" w:hAnsi="Helvetica" w:cs="Helvetica"/>
-          <w:b/>
-          <w:bCs/>
-          <w:color w:val="196B24" w:themeColor="accent3"/>
-          <w:kern w:val="0"/>
-        </w:rPr>
-        <w:t>/(</w:t>
-      </w:r>
-      <w:proofErr w:type="gramEnd"/>
-      <w:r>
-        <w:rPr>
-          <w:rFonts w:ascii="Helvetica" w:hAnsi="Helvetica" w:cs="Helvetica"/>
-          <w:b/>
-          <w:bCs/>
-          <w:color w:val="196B24" w:themeColor="accent3"/>
-          <w:kern w:val="0"/>
-        </w:rPr>
-        <w:t xml:space="preserve">n </w:t>
-      </w:r>
-      <w:proofErr w:type="gramStart"/>
-      <w:r>
-        <w:rPr>
-          <w:rFonts w:ascii="Helvetica" w:hAnsi="Helvetica" w:cs="Helvetica"/>
-          <w:b/>
-          <w:bCs/>
-          <w:color w:val="196B24" w:themeColor="accent3"/>
-          <w:kern w:val="0"/>
-        </w:rPr>
-        <w:t>+  2</w:t>
-      </w:r>
-      <w:proofErr w:type="gramEnd"/>
-      <w:r>
-        <w:rPr>
-          <w:rFonts w:ascii="Helvetica" w:hAnsi="Helvetica" w:cs="Helvetica"/>
-          <w:b/>
-          <w:bCs/>
-          <w:color w:val="196B24" w:themeColor="accent3"/>
-          <w:kern w:val="0"/>
-        </w:rPr>
-        <w:t xml:space="preserve">) in the denominator </w:t>
+        <w:t xml:space="preserve">zero p-values = + 1 /(n +  2) in the denominator </w:t>
       </w:r>
     </w:p>
     <w:p>
@@ -1188,9 +2522,8 @@
           <w:color w:val="196B24" w:themeColor="accent3"/>
           <w:kern w:val="0"/>
         </w:rPr>
-        <w:t xml:space="preserve">) gives a valid frequentist p-value — it's the probability that a random permutation beats your score, with the observed statistic counted as part of its own reference set. The n+2 correction gives the best point estimate of what the true p-value </w:t>
-      </w:r>
-      <w:proofErr w:type="gramStart"/>
+        <w:t xml:space="preserve">) gives a valid frequentist p-value — it's the probability that a </w:t>
+      </w:r>
       <w:r>
         <w:rPr>
           <w:rFonts w:ascii="Helvetica" w:hAnsi="Helvetica" w:cs="Helvetica"/>
@@ -1199,18 +2532,8 @@
           <w:color w:val="196B24" w:themeColor="accent3"/>
           <w:kern w:val="0"/>
         </w:rPr>
-        <w:t>actually is</w:t>
-      </w:r>
-      <w:proofErr w:type="gramEnd"/>
-      <w:r>
-        <w:rPr>
-          <w:rFonts w:ascii="Helvetica" w:hAnsi="Helvetica" w:cs="Helvetica"/>
-          <w:b/>
-          <w:bCs/>
-          <w:color w:val="196B24" w:themeColor="accent3"/>
-          <w:kern w:val="0"/>
-        </w:rPr>
-        <w:t>, given what you observed and a flat prior.</w:t>
+        <w:lastRenderedPageBreak/>
+        <w:t>random permutation beats your score, with the observed statistic counted as part of its own reference set. The n+2 correction gives the best point estimate of what the true p-value actually is, given what you observed and a flat prior.</w:t>
       </w:r>
     </w:p>
     <w:p>
@@ -1429,7 +2752,6 @@
           <w:color w:val="196B24" w:themeColor="accent3"/>
           <w:kern w:val="0"/>
         </w:rPr>
-        <w:lastRenderedPageBreak/>
         <w:t xml:space="preserve">Fix the inconsistent lengths — grab aligned from </w:t>
       </w:r>
       <w:proofErr w:type="spellStart"/>
@@ -1483,25 +2805,7 @@
           <w:color w:val="196B24" w:themeColor="accent3"/>
           <w:kern w:val="0"/>
         </w:rPr>
-        <w:t xml:space="preserve">Decrementing the percentile </w:t>
-      </w:r>
-      <w:proofErr w:type="gramStart"/>
-      <w:r>
-        <w:rPr>
-          <w:rFonts w:ascii="Helvetica" w:hAnsi="Helvetica" w:cs="Helvetica"/>
-          <w:color w:val="196B24" w:themeColor="accent3"/>
-          <w:kern w:val="0"/>
-        </w:rPr>
-        <w:t>threshold  —</w:t>
-      </w:r>
-      <w:proofErr w:type="gramEnd"/>
-      <w:r>
-        <w:rPr>
-          <w:rFonts w:ascii="Helvetica" w:hAnsi="Helvetica" w:cs="Helvetica"/>
-          <w:color w:val="196B24" w:themeColor="accent3"/>
-          <w:kern w:val="0"/>
-        </w:rPr>
-        <w:t xml:space="preserve"> the user should do that, leave it alone and let it output just none.</w:t>
+        <w:t>Decrementing the percentile threshold  — the user should do that, leave it alone and let it output just none.</w:t>
       </w:r>
       <w:r>
         <w:rPr>
@@ -2035,18 +3339,9 @@
           <w:rFonts w:ascii="Helvetica" w:hAnsi="Helvetica" w:cs="Helvetica"/>
           <w:kern w:val="0"/>
         </w:rPr>
-        <w:t xml:space="preserve">or </w:t>
-      </w:r>
-      <w:proofErr w:type="gramStart"/>
-      <w:r>
-        <w:rPr>
-          <w:rFonts w:ascii="Helvetica" w:hAnsi="Helvetica" w:cs="Helvetica"/>
-          <w:kern w:val="0"/>
-        </w:rPr>
-        <w:t>min(</w:t>
+        <w:t>or min(</w:t>
       </w:r>
       <w:proofErr w:type="spellStart"/>
-      <w:proofErr w:type="gramEnd"/>
       <w:r>
         <w:rPr>
           <w:rFonts w:ascii="Helvetica" w:hAnsi="Helvetica" w:cs="Helvetica"/>
@@ -2685,264 +3980,184 @@
           <w:rFonts w:ascii="Helvetica" w:hAnsi="Helvetica" w:cs="Helvetica"/>
           <w:kern w:val="0"/>
         </w:rPr>
-        <w:t xml:space="preserve">* </w:t>
-      </w:r>
-      <w:proofErr w:type="gramStart"/>
-      <w:r>
-        <w:rPr>
-          <w:rFonts w:ascii="Helvetica" w:hAnsi="Helvetica" w:cs="Helvetica"/>
-          <w:kern w:val="0"/>
-        </w:rPr>
-        <w:t>our</w:t>
-      </w:r>
-      <w:proofErr w:type="gramEnd"/>
-      <w:r>
-        <w:rPr>
-          <w:rFonts w:ascii="Helvetica" w:hAnsi="Helvetica" w:cs="Helvetica"/>
-          <w:kern w:val="0"/>
-        </w:rPr>
-        <w:t xml:space="preserve"> base assumption of a dimeric (or tetrameric) binding conformation and use that to evaluate the candidate patterns </w:t>
-      </w:r>
-    </w:p>
-    <w:p>
-      <w:pPr>
-        <w:tabs>
-          <w:tab w:val="left" w:pos="720"/>
-          <w:tab w:val="left" w:pos="1440"/>
-          <w:tab w:val="left" w:pos="2160"/>
-          <w:tab w:val="left" w:pos="2880"/>
-          <w:tab w:val="left" w:pos="3600"/>
-          <w:tab w:val="left" w:pos="4320"/>
-          <w:tab w:val="left" w:pos="5040"/>
-          <w:tab w:val="left" w:pos="5760"/>
-          <w:tab w:val="left" w:pos="6480"/>
-          <w:tab w:val="left" w:pos="7200"/>
-          <w:tab w:val="left" w:pos="7920"/>
-          <w:tab w:val="left" w:pos="8640"/>
-        </w:tabs>
-        <w:autoSpaceDE w:val="0"/>
-        <w:autoSpaceDN w:val="0"/>
-        <w:adjustRightInd w:val="0"/>
-        <w:spacing w:after="0" w:line="240" w:lineRule="auto"/>
-        <w:rPr>
-          <w:rFonts w:ascii="Helvetica" w:hAnsi="Helvetica" w:cs="Helvetica"/>
-          <w:kern w:val="0"/>
-        </w:rPr>
-      </w:pPr>
-    </w:p>
-    <w:p>
-      <w:pPr>
-        <w:tabs>
-          <w:tab w:val="left" w:pos="720"/>
-          <w:tab w:val="left" w:pos="1440"/>
-          <w:tab w:val="left" w:pos="2160"/>
-          <w:tab w:val="left" w:pos="2880"/>
-          <w:tab w:val="left" w:pos="3600"/>
-          <w:tab w:val="left" w:pos="4320"/>
-          <w:tab w:val="left" w:pos="5040"/>
-          <w:tab w:val="left" w:pos="5760"/>
-          <w:tab w:val="left" w:pos="6480"/>
-          <w:tab w:val="left" w:pos="7200"/>
-          <w:tab w:val="left" w:pos="7920"/>
-          <w:tab w:val="left" w:pos="8640"/>
-        </w:tabs>
-        <w:autoSpaceDE w:val="0"/>
-        <w:autoSpaceDN w:val="0"/>
-        <w:adjustRightInd w:val="0"/>
-        <w:spacing w:after="0" w:line="240" w:lineRule="auto"/>
-        <w:rPr>
-          <w:rFonts w:ascii="Helvetica" w:hAnsi="Helvetica" w:cs="Helvetica"/>
-          <w:kern w:val="0"/>
-        </w:rPr>
-      </w:pPr>
-      <w:r>
-        <w:rPr>
-          <w:rFonts w:ascii="Helvetica" w:hAnsi="Helvetica" w:cs="Helvetica"/>
-          <w:kern w:val="0"/>
-        </w:rPr>
-        <w:t xml:space="preserve">* </w:t>
-      </w:r>
-      <w:proofErr w:type="gramStart"/>
-      <w:r>
-        <w:rPr>
-          <w:rFonts w:ascii="Helvetica" w:hAnsi="Helvetica" w:cs="Helvetica"/>
-          <w:kern w:val="0"/>
-        </w:rPr>
-        <w:t>we</w:t>
-      </w:r>
-      <w:proofErr w:type="gramEnd"/>
-      <w:r>
-        <w:rPr>
-          <w:rFonts w:ascii="Helvetica" w:hAnsi="Helvetica" w:cs="Helvetica"/>
-          <w:kern w:val="0"/>
-        </w:rPr>
-        <w:t xml:space="preserve"> have some downstream outputs from motif discovery, how can we automate the evaluation of whether the motif is an actual binding site or </w:t>
-      </w:r>
-      <w:proofErr w:type="gramStart"/>
-      <w:r>
-        <w:rPr>
-          <w:rFonts w:ascii="Helvetica" w:hAnsi="Helvetica" w:cs="Helvetica"/>
-          <w:kern w:val="0"/>
-        </w:rPr>
-        <w:t>not ?</w:t>
-      </w:r>
-      <w:proofErr w:type="gramEnd"/>
-      <w:r>
-        <w:rPr>
-          <w:rFonts w:ascii="Helvetica" w:hAnsi="Helvetica" w:cs="Helvetica"/>
-          <w:kern w:val="0"/>
-        </w:rPr>
-        <w:t xml:space="preserve"> </w:t>
-      </w:r>
-    </w:p>
-    <w:p>
-      <w:pPr>
-        <w:tabs>
-          <w:tab w:val="left" w:pos="720"/>
-          <w:tab w:val="left" w:pos="1440"/>
-          <w:tab w:val="left" w:pos="2160"/>
-          <w:tab w:val="left" w:pos="2880"/>
-          <w:tab w:val="left" w:pos="3600"/>
-          <w:tab w:val="left" w:pos="4320"/>
-          <w:tab w:val="left" w:pos="5040"/>
-          <w:tab w:val="left" w:pos="5760"/>
-          <w:tab w:val="left" w:pos="6480"/>
-          <w:tab w:val="left" w:pos="7200"/>
-          <w:tab w:val="left" w:pos="7920"/>
-          <w:tab w:val="left" w:pos="8640"/>
-        </w:tabs>
-        <w:autoSpaceDE w:val="0"/>
-        <w:autoSpaceDN w:val="0"/>
-        <w:adjustRightInd w:val="0"/>
-        <w:spacing w:after="0" w:line="240" w:lineRule="auto"/>
-        <w:rPr>
-          <w:rFonts w:ascii="Helvetica" w:hAnsi="Helvetica" w:cs="Helvetica"/>
-          <w:kern w:val="0"/>
-        </w:rPr>
-      </w:pPr>
-    </w:p>
-    <w:p>
-      <w:pPr>
-        <w:tabs>
-          <w:tab w:val="left" w:pos="720"/>
-          <w:tab w:val="left" w:pos="1440"/>
-          <w:tab w:val="left" w:pos="2160"/>
-          <w:tab w:val="left" w:pos="2880"/>
-          <w:tab w:val="left" w:pos="3600"/>
-          <w:tab w:val="left" w:pos="4320"/>
-          <w:tab w:val="left" w:pos="5040"/>
-          <w:tab w:val="left" w:pos="5760"/>
-          <w:tab w:val="left" w:pos="6480"/>
-          <w:tab w:val="left" w:pos="7200"/>
-          <w:tab w:val="left" w:pos="7920"/>
-          <w:tab w:val="left" w:pos="8640"/>
-        </w:tabs>
-        <w:autoSpaceDE w:val="0"/>
-        <w:autoSpaceDN w:val="0"/>
-        <w:adjustRightInd w:val="0"/>
-        <w:spacing w:after="0" w:line="240" w:lineRule="auto"/>
-        <w:rPr>
-          <w:rFonts w:ascii="Helvetica" w:hAnsi="Helvetica" w:cs="Helvetica"/>
-          <w:kern w:val="0"/>
-        </w:rPr>
-      </w:pPr>
-    </w:p>
-    <w:p>
-      <w:pPr>
-        <w:tabs>
-          <w:tab w:val="left" w:pos="720"/>
-          <w:tab w:val="left" w:pos="1440"/>
-          <w:tab w:val="left" w:pos="2160"/>
-          <w:tab w:val="left" w:pos="2880"/>
-          <w:tab w:val="left" w:pos="3600"/>
-          <w:tab w:val="left" w:pos="4320"/>
-          <w:tab w:val="left" w:pos="5040"/>
-          <w:tab w:val="left" w:pos="5760"/>
-          <w:tab w:val="left" w:pos="6480"/>
-          <w:tab w:val="left" w:pos="7200"/>
-          <w:tab w:val="left" w:pos="7920"/>
-          <w:tab w:val="left" w:pos="8640"/>
-        </w:tabs>
-        <w:autoSpaceDE w:val="0"/>
-        <w:autoSpaceDN w:val="0"/>
-        <w:adjustRightInd w:val="0"/>
-        <w:spacing w:after="0" w:line="240" w:lineRule="auto"/>
-        <w:rPr>
-          <w:rFonts w:ascii="Helvetica" w:hAnsi="Helvetica" w:cs="Helvetica"/>
-          <w:kern w:val="0"/>
-        </w:rPr>
-      </w:pPr>
-      <w:r>
-        <w:rPr>
-          <w:rFonts w:ascii="Helvetica" w:hAnsi="Helvetica" w:cs="Helvetica"/>
-          <w:kern w:val="0"/>
-        </w:rPr>
-        <w:t xml:space="preserve">* </w:t>
-      </w:r>
-      <w:proofErr w:type="gramStart"/>
-      <w:r>
-        <w:rPr>
-          <w:rFonts w:ascii="Helvetica" w:hAnsi="Helvetica" w:cs="Helvetica"/>
-          <w:kern w:val="0"/>
-        </w:rPr>
-        <w:t>other</w:t>
-      </w:r>
-      <w:proofErr w:type="gramEnd"/>
-      <w:r>
-        <w:rPr>
-          <w:rFonts w:ascii="Helvetica" w:hAnsi="Helvetica" w:cs="Helvetica"/>
-          <w:kern w:val="0"/>
-        </w:rPr>
-        <w:t xml:space="preserve"> ways to evaluate a motif candidate — coverage in the genome </w:t>
-      </w:r>
-    </w:p>
-    <w:p>
-      <w:pPr>
-        <w:tabs>
-          <w:tab w:val="left" w:pos="720"/>
-          <w:tab w:val="left" w:pos="1440"/>
-          <w:tab w:val="left" w:pos="2160"/>
-          <w:tab w:val="left" w:pos="2880"/>
-          <w:tab w:val="left" w:pos="3600"/>
-          <w:tab w:val="left" w:pos="4320"/>
-          <w:tab w:val="left" w:pos="5040"/>
-          <w:tab w:val="left" w:pos="5760"/>
-          <w:tab w:val="left" w:pos="6480"/>
-          <w:tab w:val="left" w:pos="7200"/>
-          <w:tab w:val="left" w:pos="7920"/>
-          <w:tab w:val="left" w:pos="8640"/>
-        </w:tabs>
-        <w:autoSpaceDE w:val="0"/>
-        <w:autoSpaceDN w:val="0"/>
-        <w:adjustRightInd w:val="0"/>
-        <w:spacing w:after="0" w:line="240" w:lineRule="auto"/>
-        <w:rPr>
-          <w:rFonts w:ascii="Helvetica" w:hAnsi="Helvetica" w:cs="Helvetica"/>
-          <w:kern w:val="0"/>
-        </w:rPr>
-      </w:pPr>
-      <w:r>
-        <w:rPr>
-          <w:rFonts w:ascii="Helvetica" w:hAnsi="Helvetica" w:cs="Helvetica"/>
-          <w:kern w:val="0"/>
-        </w:rPr>
-        <w:t xml:space="preserve">* </w:t>
-      </w:r>
-      <w:proofErr w:type="gramStart"/>
-      <w:r>
-        <w:rPr>
-          <w:rFonts w:ascii="Helvetica" w:hAnsi="Helvetica" w:cs="Helvetica"/>
-          <w:kern w:val="0"/>
-        </w:rPr>
-        <w:t>the</w:t>
-      </w:r>
-      <w:proofErr w:type="gramEnd"/>
-      <w:r>
-        <w:rPr>
-          <w:rFonts w:ascii="Helvetica" w:hAnsi="Helvetica" w:cs="Helvetica"/>
-          <w:kern w:val="0"/>
-        </w:rPr>
-        <w:t xml:space="preserve"> problem is that many things are conserved and statistically significant, but the conservation does not necessarily denote an actual binding site </w:t>
+        <w:t xml:space="preserve">* our base assumption of a dimeric (or tetrameric) binding conformation and use that to evaluate the candidate patterns </w:t>
+      </w:r>
+    </w:p>
+    <w:p>
+      <w:pPr>
+        <w:tabs>
+          <w:tab w:val="left" w:pos="720"/>
+          <w:tab w:val="left" w:pos="1440"/>
+          <w:tab w:val="left" w:pos="2160"/>
+          <w:tab w:val="left" w:pos="2880"/>
+          <w:tab w:val="left" w:pos="3600"/>
+          <w:tab w:val="left" w:pos="4320"/>
+          <w:tab w:val="left" w:pos="5040"/>
+          <w:tab w:val="left" w:pos="5760"/>
+          <w:tab w:val="left" w:pos="6480"/>
+          <w:tab w:val="left" w:pos="7200"/>
+          <w:tab w:val="left" w:pos="7920"/>
+          <w:tab w:val="left" w:pos="8640"/>
+        </w:tabs>
+        <w:autoSpaceDE w:val="0"/>
+        <w:autoSpaceDN w:val="0"/>
+        <w:adjustRightInd w:val="0"/>
+        <w:spacing w:after="0" w:line="240" w:lineRule="auto"/>
+        <w:rPr>
+          <w:rFonts w:ascii="Helvetica" w:hAnsi="Helvetica" w:cs="Helvetica"/>
+          <w:kern w:val="0"/>
+        </w:rPr>
+      </w:pPr>
+    </w:p>
+    <w:p>
+      <w:pPr>
+        <w:tabs>
+          <w:tab w:val="left" w:pos="720"/>
+          <w:tab w:val="left" w:pos="1440"/>
+          <w:tab w:val="left" w:pos="2160"/>
+          <w:tab w:val="left" w:pos="2880"/>
+          <w:tab w:val="left" w:pos="3600"/>
+          <w:tab w:val="left" w:pos="4320"/>
+          <w:tab w:val="left" w:pos="5040"/>
+          <w:tab w:val="left" w:pos="5760"/>
+          <w:tab w:val="left" w:pos="6480"/>
+          <w:tab w:val="left" w:pos="7200"/>
+          <w:tab w:val="left" w:pos="7920"/>
+          <w:tab w:val="left" w:pos="8640"/>
+        </w:tabs>
+        <w:autoSpaceDE w:val="0"/>
+        <w:autoSpaceDN w:val="0"/>
+        <w:adjustRightInd w:val="0"/>
+        <w:spacing w:after="0" w:line="240" w:lineRule="auto"/>
+        <w:rPr>
+          <w:rFonts w:ascii="Helvetica" w:hAnsi="Helvetica" w:cs="Helvetica"/>
+          <w:kern w:val="0"/>
+        </w:rPr>
+      </w:pPr>
+      <w:r>
+        <w:rPr>
+          <w:rFonts w:ascii="Helvetica" w:hAnsi="Helvetica" w:cs="Helvetica"/>
+          <w:kern w:val="0"/>
+        </w:rPr>
+        <w:t xml:space="preserve">* we have some downstream outputs from motif discovery, how can we automate the evaluation of whether the motif is an actual binding site or not ? </w:t>
+      </w:r>
+    </w:p>
+    <w:p>
+      <w:pPr>
+        <w:tabs>
+          <w:tab w:val="left" w:pos="720"/>
+          <w:tab w:val="left" w:pos="1440"/>
+          <w:tab w:val="left" w:pos="2160"/>
+          <w:tab w:val="left" w:pos="2880"/>
+          <w:tab w:val="left" w:pos="3600"/>
+          <w:tab w:val="left" w:pos="4320"/>
+          <w:tab w:val="left" w:pos="5040"/>
+          <w:tab w:val="left" w:pos="5760"/>
+          <w:tab w:val="left" w:pos="6480"/>
+          <w:tab w:val="left" w:pos="7200"/>
+          <w:tab w:val="left" w:pos="7920"/>
+          <w:tab w:val="left" w:pos="8640"/>
+        </w:tabs>
+        <w:autoSpaceDE w:val="0"/>
+        <w:autoSpaceDN w:val="0"/>
+        <w:adjustRightInd w:val="0"/>
+        <w:spacing w:after="0" w:line="240" w:lineRule="auto"/>
+        <w:rPr>
+          <w:rFonts w:ascii="Helvetica" w:hAnsi="Helvetica" w:cs="Helvetica"/>
+          <w:kern w:val="0"/>
+        </w:rPr>
+      </w:pPr>
+    </w:p>
+    <w:p>
+      <w:pPr>
+        <w:tabs>
+          <w:tab w:val="left" w:pos="720"/>
+          <w:tab w:val="left" w:pos="1440"/>
+          <w:tab w:val="left" w:pos="2160"/>
+          <w:tab w:val="left" w:pos="2880"/>
+          <w:tab w:val="left" w:pos="3600"/>
+          <w:tab w:val="left" w:pos="4320"/>
+          <w:tab w:val="left" w:pos="5040"/>
+          <w:tab w:val="left" w:pos="5760"/>
+          <w:tab w:val="left" w:pos="6480"/>
+          <w:tab w:val="left" w:pos="7200"/>
+          <w:tab w:val="left" w:pos="7920"/>
+          <w:tab w:val="left" w:pos="8640"/>
+        </w:tabs>
+        <w:autoSpaceDE w:val="0"/>
+        <w:autoSpaceDN w:val="0"/>
+        <w:adjustRightInd w:val="0"/>
+        <w:spacing w:after="0" w:line="240" w:lineRule="auto"/>
+        <w:rPr>
+          <w:rFonts w:ascii="Helvetica" w:hAnsi="Helvetica" w:cs="Helvetica"/>
+          <w:kern w:val="0"/>
+        </w:rPr>
+      </w:pPr>
+    </w:p>
+    <w:p>
+      <w:pPr>
+        <w:tabs>
+          <w:tab w:val="left" w:pos="720"/>
+          <w:tab w:val="left" w:pos="1440"/>
+          <w:tab w:val="left" w:pos="2160"/>
+          <w:tab w:val="left" w:pos="2880"/>
+          <w:tab w:val="left" w:pos="3600"/>
+          <w:tab w:val="left" w:pos="4320"/>
+          <w:tab w:val="left" w:pos="5040"/>
+          <w:tab w:val="left" w:pos="5760"/>
+          <w:tab w:val="left" w:pos="6480"/>
+          <w:tab w:val="left" w:pos="7200"/>
+          <w:tab w:val="left" w:pos="7920"/>
+          <w:tab w:val="left" w:pos="8640"/>
+        </w:tabs>
+        <w:autoSpaceDE w:val="0"/>
+        <w:autoSpaceDN w:val="0"/>
+        <w:adjustRightInd w:val="0"/>
+        <w:spacing w:after="0" w:line="240" w:lineRule="auto"/>
+        <w:rPr>
+          <w:rFonts w:ascii="Helvetica" w:hAnsi="Helvetica" w:cs="Helvetica"/>
+          <w:kern w:val="0"/>
+        </w:rPr>
+      </w:pPr>
+      <w:r>
+        <w:rPr>
+          <w:rFonts w:ascii="Helvetica" w:hAnsi="Helvetica" w:cs="Helvetica"/>
+          <w:kern w:val="0"/>
+        </w:rPr>
+        <w:t xml:space="preserve">* other ways to evaluate a motif candidate — coverage in the genome </w:t>
+      </w:r>
+    </w:p>
+    <w:p>
+      <w:pPr>
+        <w:tabs>
+          <w:tab w:val="left" w:pos="720"/>
+          <w:tab w:val="left" w:pos="1440"/>
+          <w:tab w:val="left" w:pos="2160"/>
+          <w:tab w:val="left" w:pos="2880"/>
+          <w:tab w:val="left" w:pos="3600"/>
+          <w:tab w:val="left" w:pos="4320"/>
+          <w:tab w:val="left" w:pos="5040"/>
+          <w:tab w:val="left" w:pos="5760"/>
+          <w:tab w:val="left" w:pos="6480"/>
+          <w:tab w:val="left" w:pos="7200"/>
+          <w:tab w:val="left" w:pos="7920"/>
+          <w:tab w:val="left" w:pos="8640"/>
+        </w:tabs>
+        <w:autoSpaceDE w:val="0"/>
+        <w:autoSpaceDN w:val="0"/>
+        <w:adjustRightInd w:val="0"/>
+        <w:spacing w:after="0" w:line="240" w:lineRule="auto"/>
+        <w:rPr>
+          <w:rFonts w:ascii="Helvetica" w:hAnsi="Helvetica" w:cs="Helvetica"/>
+          <w:kern w:val="0"/>
+        </w:rPr>
+      </w:pPr>
+      <w:r>
+        <w:rPr>
+          <w:rFonts w:ascii="Helvetica" w:hAnsi="Helvetica" w:cs="Helvetica"/>
+          <w:kern w:val="0"/>
+        </w:rPr>
+        <w:t xml:space="preserve">* the problem is that many things are conserved and statistically significant, but the conservation does not necessarily denote an actual binding site </w:t>
       </w:r>
     </w:p>
     <w:p>
@@ -3013,23 +4228,7 @@
           <w:rFonts w:ascii="Helvetica" w:hAnsi="Helvetica" w:cs="Helvetica"/>
           <w:kern w:val="0"/>
         </w:rPr>
-        <w:t xml:space="preserve">for our case of the bacterial transcription </w:t>
-      </w:r>
-      <w:proofErr w:type="gramStart"/>
-      <w:r>
-        <w:rPr>
-          <w:rFonts w:ascii="Helvetica" w:hAnsi="Helvetica" w:cs="Helvetica"/>
-          <w:kern w:val="0"/>
-        </w:rPr>
-        <w:t>factors</w:t>
-      </w:r>
-      <w:proofErr w:type="gramEnd"/>
-      <w:r>
-        <w:rPr>
-          <w:rFonts w:ascii="Helvetica" w:hAnsi="Helvetica" w:cs="Helvetica"/>
-          <w:kern w:val="0"/>
-        </w:rPr>
-        <w:t xml:space="preserve"> we use the base heuristic that the IR/DR  </w:t>
+        <w:t xml:space="preserve">for our case of the bacterial transcription factors we use the base heuristic that the IR/DR  </w:t>
       </w:r>
     </w:p>
     <w:p>
@@ -3110,67 +4309,127 @@
         </w:rPr>
         <w:t xml:space="preserve"> — </w:t>
       </w:r>
-      <w:hyperlink r:id="rId7" w:anchor="L26" w:history="1">
+      <w:r>
+        <w:fldChar w:fldCharType="begin"/>
+      </w:r>
+      <w:r>
+        <w:instrText>HYPERLINK "https://github.com/ErillLab/collectf/blob/45f7621f408acabc739c21617294e2fc207875b2/src/core/motif_structure.py" \l "L26"</w:instrText>
+      </w:r>
+      <w:r>
+        <w:fldChar w:fldCharType="separate"/>
+      </w:r>
+      <w:r>
+        <w:rPr>
+          <w:rFonts w:ascii="Helvetica" w:hAnsi="Helvetica" w:cs="Helvetica"/>
+          <w:kern w:val="0"/>
+        </w:rPr>
+        <w:t>https://</w:t>
+      </w:r>
+      <w:r>
+        <w:rPr>
+          <w:rFonts w:ascii="Helvetica" w:hAnsi="Helvetica" w:cs="Helvetica"/>
+          <w:kern w:val="0"/>
+        </w:rPr>
+        <w:t>g</w:t>
+      </w:r>
+      <w:r>
+        <w:rPr>
+          <w:rFonts w:ascii="Helvetica" w:hAnsi="Helvetica" w:cs="Helvetica"/>
+          <w:kern w:val="0"/>
+        </w:rPr>
+        <w:t>ithub.com/ErillLab/collectf/blob/45f7621f4</w:t>
+      </w:r>
+      <w:r>
+        <w:rPr>
+          <w:rFonts w:ascii="Helvetica" w:hAnsi="Helvetica" w:cs="Helvetica"/>
+          <w:kern w:val="0"/>
+        </w:rPr>
+        <w:t>0</w:t>
+      </w:r>
+      <w:r>
+        <w:rPr>
+          <w:rFonts w:ascii="Helvetica" w:hAnsi="Helvetica" w:cs="Helvetica"/>
+          <w:kern w:val="0"/>
+        </w:rPr>
+        <w:t>8acabc739c21617294e2fc207875b2/src/core/motif_structure.py#L26</w:t>
+      </w:r>
+      <w:r>
+        <w:fldChar w:fldCharType="end"/>
+      </w:r>
+    </w:p>
+    <w:p>
+      <w:pPr>
+        <w:tabs>
+          <w:tab w:val="left" w:pos="720"/>
+          <w:tab w:val="left" w:pos="1440"/>
+          <w:tab w:val="left" w:pos="2160"/>
+          <w:tab w:val="left" w:pos="2880"/>
+          <w:tab w:val="left" w:pos="3600"/>
+          <w:tab w:val="left" w:pos="4320"/>
+          <w:tab w:val="left" w:pos="5040"/>
+          <w:tab w:val="left" w:pos="5760"/>
+          <w:tab w:val="left" w:pos="6480"/>
+          <w:tab w:val="left" w:pos="7200"/>
+          <w:tab w:val="left" w:pos="7920"/>
+          <w:tab w:val="left" w:pos="8640"/>
+        </w:tabs>
+        <w:autoSpaceDE w:val="0"/>
+        <w:autoSpaceDN w:val="0"/>
+        <w:adjustRightInd w:val="0"/>
+        <w:spacing w:after="0" w:line="240" w:lineRule="auto"/>
+        <w:rPr>
+          <w:rFonts w:ascii="Helvetica" w:hAnsi="Helvetica" w:cs="Helvetica"/>
+          <w:kern w:val="0"/>
+        </w:rPr>
+      </w:pPr>
+    </w:p>
+    <w:p>
+      <w:pPr>
+        <w:tabs>
+          <w:tab w:val="left" w:pos="720"/>
+          <w:tab w:val="left" w:pos="1440"/>
+          <w:tab w:val="left" w:pos="2160"/>
+          <w:tab w:val="left" w:pos="2880"/>
+          <w:tab w:val="left" w:pos="3600"/>
+          <w:tab w:val="left" w:pos="4320"/>
+          <w:tab w:val="left" w:pos="5040"/>
+          <w:tab w:val="left" w:pos="5760"/>
+          <w:tab w:val="left" w:pos="6480"/>
+          <w:tab w:val="left" w:pos="7200"/>
+          <w:tab w:val="left" w:pos="7920"/>
+          <w:tab w:val="left" w:pos="8640"/>
+        </w:tabs>
+        <w:autoSpaceDE w:val="0"/>
+        <w:autoSpaceDN w:val="0"/>
+        <w:adjustRightInd w:val="0"/>
+        <w:spacing w:after="0" w:line="240" w:lineRule="auto"/>
+        <w:rPr>
+          <w:rFonts w:ascii="Helvetica" w:hAnsi="Helvetica" w:cs="Helvetica"/>
+          <w:kern w:val="0"/>
+        </w:rPr>
+      </w:pPr>
+    </w:p>
+    <w:p>
+      <w:hyperlink r:id="rId7" w:history="1">
         <w:r>
           <w:rPr>
-            <w:rFonts w:ascii="Helvetica" w:hAnsi="Helvetica" w:cs="Helvetica"/>
-            <w:kern w:val="0"/>
+            <w:rStyle w:val="Hyperlink"/>
           </w:rPr>
-          <w:t>https://github.com/ErillLab/collectf/blob/45f7621f408acabc739c21617294e2fc207875b2/src/core/motif_structure.py#L26</w:t>
+          <w:t>https://link.springer.com/article/10.1</w:t>
+        </w:r>
+        <w:r>
+          <w:rPr>
+            <w:rStyle w:val="Hyperlink"/>
+          </w:rPr>
+          <w:t>1</w:t>
+        </w:r>
+        <w:r>
+          <w:rPr>
+            <w:rStyle w:val="Hyperlink"/>
+          </w:rPr>
+          <w:t>86/gb-2007-8-2-r24</w:t>
         </w:r>
       </w:hyperlink>
-    </w:p>
-    <w:p>
-      <w:pPr>
-        <w:tabs>
-          <w:tab w:val="left" w:pos="720"/>
-          <w:tab w:val="left" w:pos="1440"/>
-          <w:tab w:val="left" w:pos="2160"/>
-          <w:tab w:val="left" w:pos="2880"/>
-          <w:tab w:val="left" w:pos="3600"/>
-          <w:tab w:val="left" w:pos="4320"/>
-          <w:tab w:val="left" w:pos="5040"/>
-          <w:tab w:val="left" w:pos="5760"/>
-          <w:tab w:val="left" w:pos="6480"/>
-          <w:tab w:val="left" w:pos="7200"/>
-          <w:tab w:val="left" w:pos="7920"/>
-          <w:tab w:val="left" w:pos="8640"/>
-        </w:tabs>
-        <w:autoSpaceDE w:val="0"/>
-        <w:autoSpaceDN w:val="0"/>
-        <w:adjustRightInd w:val="0"/>
-        <w:spacing w:after="0" w:line="240" w:lineRule="auto"/>
-        <w:rPr>
-          <w:rFonts w:ascii="Helvetica" w:hAnsi="Helvetica" w:cs="Helvetica"/>
-          <w:kern w:val="0"/>
-        </w:rPr>
-      </w:pPr>
-    </w:p>
-    <w:p>
-      <w:pPr>
-        <w:tabs>
-          <w:tab w:val="left" w:pos="720"/>
-          <w:tab w:val="left" w:pos="1440"/>
-          <w:tab w:val="left" w:pos="2160"/>
-          <w:tab w:val="left" w:pos="2880"/>
-          <w:tab w:val="left" w:pos="3600"/>
-          <w:tab w:val="left" w:pos="4320"/>
-          <w:tab w:val="left" w:pos="5040"/>
-          <w:tab w:val="left" w:pos="5760"/>
-          <w:tab w:val="left" w:pos="6480"/>
-          <w:tab w:val="left" w:pos="7200"/>
-          <w:tab w:val="left" w:pos="7920"/>
-          <w:tab w:val="left" w:pos="8640"/>
-        </w:tabs>
-        <w:autoSpaceDE w:val="0"/>
-        <w:autoSpaceDN w:val="0"/>
-        <w:adjustRightInd w:val="0"/>
-        <w:spacing w:after="0" w:line="240" w:lineRule="auto"/>
-        <w:rPr>
-          <w:rFonts w:ascii="Helvetica" w:hAnsi="Helvetica" w:cs="Helvetica"/>
-          <w:kern w:val="0"/>
-        </w:rPr>
-      </w:pPr>
     </w:p>
     <w:p>
       <w:hyperlink r:id="rId8" w:history="1">
@@ -3178,27 +4437,41 @@
           <w:rPr>
             <w:rStyle w:val="Hyperlink"/>
           </w:rPr>
-          <w:t>https://link.springer.com/article/10.1186/gb-2007-8-2-r24</w:t>
+          <w:t>https://journals.plos.org/ploscompbiol/article?i</w:t>
         </w:r>
-      </w:hyperlink>
-    </w:p>
-    <w:p>
-      <w:hyperlink r:id="rId9" w:history="1">
         <w:r>
           <w:rPr>
             <w:rStyle w:val="Hyperlink"/>
           </w:rPr>
-          <w:t>https://journals.plos.org/ploscompbiol/article?id=10.1371/journal.pcbi.1000010</w:t>
+          <w:t>d</w:t>
         </w:r>
-      </w:hyperlink>
-    </w:p>
-    <w:p>
-      <w:hyperlink r:id="rId10" w:anchor="47326445" w:history="1">
         <w:r>
           <w:rPr>
             <w:rStyle w:val="Hyperlink"/>
           </w:rPr>
-          <w:t>https://academic.oup.com/database/article/doi/10.1093/database/baw055/2630369?login=false#47326445</w:t>
+          <w:t>=10.1371/journal.pcbi.1000010</w:t>
+        </w:r>
+      </w:hyperlink>
+    </w:p>
+    <w:p>
+      <w:hyperlink r:id="rId9" w:anchor="47326445" w:history="1">
+        <w:r>
+          <w:rPr>
+            <w:rStyle w:val="Hyperlink"/>
+          </w:rPr>
+          <w:t>https://aca</w:t>
+        </w:r>
+        <w:r>
+          <w:rPr>
+            <w:rStyle w:val="Hyperlink"/>
+          </w:rPr>
+          <w:t>d</w:t>
+        </w:r>
+        <w:r>
+          <w:rPr>
+            <w:rStyle w:val="Hyperlink"/>
+          </w:rPr>
+          <w:t>emic.oup.com/database/article/doi/10.1093/database/baw055/2630369?login=false#47326445</w:t>
         </w:r>
       </w:hyperlink>
     </w:p>
@@ -3602,6 +4875,119 @@
       <w:lvlJc w:val="left"/>
     </w:lvl>
   </w:abstractNum>
+  <w:abstractNum w:abstractNumId="7" w15:restartNumberingAfterBreak="0">
+    <w:nsid w:val="643C25FF"/>
+    <w:multiLevelType w:val="hybridMultilevel"/>
+    <w:tmpl w:val="CFB85E5A"/>
+    <w:lvl w:ilvl="0" w:tplc="E92C004C">
+      <w:start w:val="6"/>
+      <w:numFmt w:val="bullet"/>
+      <w:lvlText w:val=""/>
+      <w:lvlJc w:val="left"/>
+      <w:pPr>
+        <w:ind w:left="720" w:hanging="360"/>
+      </w:pPr>
+      <w:rPr>
+        <w:rFonts w:ascii="Symbol" w:eastAsiaTheme="minorEastAsia" w:hAnsi="Symbol" w:cs="Helvetica" w:hint="default"/>
+      </w:rPr>
+    </w:lvl>
+    <w:lvl w:ilvl="1" w:tplc="04090003">
+      <w:start w:val="1"/>
+      <w:numFmt w:val="bullet"/>
+      <w:lvlText w:val="o"/>
+      <w:lvlJc w:val="left"/>
+      <w:pPr>
+        <w:ind w:left="1440" w:hanging="360"/>
+      </w:pPr>
+      <w:rPr>
+        <w:rFonts w:ascii="Courier New" w:hAnsi="Courier New" w:cs="Courier New" w:hint="default"/>
+      </w:rPr>
+    </w:lvl>
+    <w:lvl w:ilvl="2" w:tplc="04090005" w:tentative="1">
+      <w:start w:val="1"/>
+      <w:numFmt w:val="bullet"/>
+      <w:lvlText w:val=""/>
+      <w:lvlJc w:val="left"/>
+      <w:pPr>
+        <w:ind w:left="2160" w:hanging="360"/>
+      </w:pPr>
+      <w:rPr>
+        <w:rFonts w:ascii="Wingdings" w:hAnsi="Wingdings" w:hint="default"/>
+      </w:rPr>
+    </w:lvl>
+    <w:lvl w:ilvl="3" w:tplc="04090001" w:tentative="1">
+      <w:start w:val="1"/>
+      <w:numFmt w:val="bullet"/>
+      <w:lvlText w:val=""/>
+      <w:lvlJc w:val="left"/>
+      <w:pPr>
+        <w:ind w:left="2880" w:hanging="360"/>
+      </w:pPr>
+      <w:rPr>
+        <w:rFonts w:ascii="Symbol" w:hAnsi="Symbol" w:hint="default"/>
+      </w:rPr>
+    </w:lvl>
+    <w:lvl w:ilvl="4" w:tplc="04090003" w:tentative="1">
+      <w:start w:val="1"/>
+      <w:numFmt w:val="bullet"/>
+      <w:lvlText w:val="o"/>
+      <w:lvlJc w:val="left"/>
+      <w:pPr>
+        <w:ind w:left="3600" w:hanging="360"/>
+      </w:pPr>
+      <w:rPr>
+        <w:rFonts w:ascii="Courier New" w:hAnsi="Courier New" w:cs="Courier New" w:hint="default"/>
+      </w:rPr>
+    </w:lvl>
+    <w:lvl w:ilvl="5" w:tplc="04090005" w:tentative="1">
+      <w:start w:val="1"/>
+      <w:numFmt w:val="bullet"/>
+      <w:lvlText w:val=""/>
+      <w:lvlJc w:val="left"/>
+      <w:pPr>
+        <w:ind w:left="4320" w:hanging="360"/>
+      </w:pPr>
+      <w:rPr>
+        <w:rFonts w:ascii="Wingdings" w:hAnsi="Wingdings" w:hint="default"/>
+      </w:rPr>
+    </w:lvl>
+    <w:lvl w:ilvl="6" w:tplc="04090001" w:tentative="1">
+      <w:start w:val="1"/>
+      <w:numFmt w:val="bullet"/>
+      <w:lvlText w:val=""/>
+      <w:lvlJc w:val="left"/>
+      <w:pPr>
+        <w:ind w:left="5040" w:hanging="360"/>
+      </w:pPr>
+      <w:rPr>
+        <w:rFonts w:ascii="Symbol" w:hAnsi="Symbol" w:hint="default"/>
+      </w:rPr>
+    </w:lvl>
+    <w:lvl w:ilvl="7" w:tplc="04090003" w:tentative="1">
+      <w:start w:val="1"/>
+      <w:numFmt w:val="bullet"/>
+      <w:lvlText w:val="o"/>
+      <w:lvlJc w:val="left"/>
+      <w:pPr>
+        <w:ind w:left="5760" w:hanging="360"/>
+      </w:pPr>
+      <w:rPr>
+        <w:rFonts w:ascii="Courier New" w:hAnsi="Courier New" w:cs="Courier New" w:hint="default"/>
+      </w:rPr>
+    </w:lvl>
+    <w:lvl w:ilvl="8" w:tplc="04090005" w:tentative="1">
+      <w:start w:val="1"/>
+      <w:numFmt w:val="bullet"/>
+      <w:lvlText w:val=""/>
+      <w:lvlJc w:val="left"/>
+      <w:pPr>
+        <w:ind w:left="6480" w:hanging="360"/>
+      </w:pPr>
+      <w:rPr>
+        <w:rFonts w:ascii="Wingdings" w:hAnsi="Wingdings" w:hint="default"/>
+      </w:rPr>
+    </w:lvl>
+  </w:abstractNum>
   <w:num w:numId="1" w16cid:durableId="678579578">
     <w:abstractNumId w:val="0"/>
   </w:num>
@@ -3622,6 +5008,9 @@
   </w:num>
   <w:num w:numId="7" w16cid:durableId="1842742144">
     <w:abstractNumId w:val="6"/>
+  </w:num>
+  <w:num w:numId="8" w16cid:durableId="324476532">
+    <w:abstractNumId w:val="7"/>
   </w:num>
 </w:numbering>
 </file>
@@ -4229,7 +5618,6 @@
   <w:style w:type="character" w:default="1" w:styleId="DefaultParagraphFont">
     <w:name w:val="Default Paragraph Font"/>
     <w:uiPriority w:val="1"/>
-    <w:semiHidden/>
     <w:unhideWhenUsed/>
   </w:style>
   <w:style w:type="table" w:default="1" w:styleId="TableNormal">
@@ -4584,6 +5972,18 @@
     <w:semiHidden/>
     <w:rsid w:val="004204EF"/>
   </w:style>
+  <w:style w:type="character" w:styleId="FollowedHyperlink">
+    <w:name w:val="FollowedHyperlink"/>
+    <w:basedOn w:val="DefaultParagraphFont"/>
+    <w:uiPriority w:val="99"/>
+    <w:semiHidden/>
+    <w:unhideWhenUsed/>
+    <w:rsid w:val="00AC416C"/>
+    <w:rPr>
+      <w:color w:val="96607D" w:themeColor="followedHyperlink"/>
+      <w:u w:val="single"/>
+    </w:rPr>
+  </w:style>
 </w:styles>
 </file>
 

</xml_diff>